<commit_message>
Update Callum Wyndham - WHS Management Plan.docx
</commit_message>
<xml_diff>
--- a/Callum Wyndham - WHS Management Plan.docx
+++ b/Callum Wyndham - WHS Management Plan.docx
@@ -3485,7 +3485,7 @@
     <w:p/>
     <w:tbl>
       <w:tblPr>
-        <w:tblW w:w="0" w:type="auto"/>
+        <w:tblW w:w="15714" w:type="dxa"/>
         <w:jc w:val="center"/>
         <w:tblBorders>
           <w:top w:val="single" w:sz="4" w:space="0" w:color="auto"/>
@@ -3506,10 +3506,12 @@
         <w:gridCol w:w="1842"/>
         <w:gridCol w:w="362"/>
         <w:gridCol w:w="2332"/>
-        <w:gridCol w:w="992"/>
-        <w:gridCol w:w="850"/>
-        <w:gridCol w:w="426"/>
-        <w:gridCol w:w="3685"/>
+        <w:gridCol w:w="1398"/>
+        <w:gridCol w:w="1323"/>
+        <w:gridCol w:w="14"/>
+        <w:gridCol w:w="255"/>
+        <w:gridCol w:w="3671"/>
+        <w:gridCol w:w="14"/>
       </w:tblGrid>
       <w:tr>
         <w:trPr>
@@ -3592,8 +3594,8 @@
         </w:tc>
         <w:tc>
           <w:tcPr>
-            <w:tcW w:w="4174" w:type="dxa"/>
-            <w:gridSpan w:val="3"/>
+            <w:tcW w:w="5067" w:type="dxa"/>
+            <w:gridSpan w:val="4"/>
             <w:shd w:val="clear" w:color="auto" w:fill="B5DAFF"/>
           </w:tcPr>
           <w:p>
@@ -3607,7 +3609,7 @@
         </w:tc>
         <w:tc>
           <w:tcPr>
-            <w:tcW w:w="426" w:type="dxa"/>
+            <w:tcW w:w="255" w:type="dxa"/>
             <w:shd w:val="clear" w:color="auto" w:fill="FFC425"/>
           </w:tcPr>
           <w:p>
@@ -3623,6 +3625,7 @@
         <w:tc>
           <w:tcPr>
             <w:tcW w:w="3685" w:type="dxa"/>
+            <w:gridSpan w:val="2"/>
             <w:shd w:val="clear" w:color="auto" w:fill="B5DAFF"/>
           </w:tcPr>
           <w:p>
@@ -3637,6 +3640,8 @@
       </w:tr>
       <w:tr>
         <w:trPr>
+          <w:gridAfter w:val="1"/>
+          <w:wAfter w:w="14" w:type="dxa"/>
           <w:trHeight w:val="60"/>
           <w:jc w:val="center"/>
         </w:trPr>
@@ -3705,7 +3710,7 @@
         </w:tc>
         <w:tc>
           <w:tcPr>
-            <w:tcW w:w="992" w:type="dxa"/>
+            <w:tcW w:w="1398" w:type="dxa"/>
             <w:vMerge w:val="restart"/>
             <w:shd w:val="clear" w:color="auto" w:fill="B5DAFF"/>
           </w:tcPr>
@@ -3720,7 +3725,7 @@
         </w:tc>
         <w:tc>
           <w:tcPr>
-            <w:tcW w:w="850" w:type="dxa"/>
+            <w:tcW w:w="1323" w:type="dxa"/>
             <w:vMerge w:val="restart"/>
             <w:shd w:val="clear" w:color="auto" w:fill="B5DAFF"/>
           </w:tcPr>
@@ -3735,8 +3740,8 @@
         </w:tc>
         <w:tc>
           <w:tcPr>
-            <w:tcW w:w="4111" w:type="dxa"/>
-            <w:gridSpan w:val="2"/>
+            <w:tcW w:w="3940" w:type="dxa"/>
+            <w:gridSpan w:val="3"/>
             <w:shd w:val="clear" w:color="auto" w:fill="B5DAFF"/>
           </w:tcPr>
           <w:p>
@@ -3751,6 +3756,8 @@
       </w:tr>
       <w:tr>
         <w:trPr>
+          <w:gridAfter w:val="1"/>
+          <w:wAfter w:w="14" w:type="dxa"/>
           <w:trHeight w:val="60"/>
           <w:jc w:val="center"/>
         </w:trPr>
@@ -3835,7 +3842,7 @@
         </w:tc>
         <w:tc>
           <w:tcPr>
-            <w:tcW w:w="992" w:type="dxa"/>
+            <w:tcW w:w="1398" w:type="dxa"/>
             <w:vMerge/>
             <w:shd w:val="clear" w:color="auto" w:fill="B5DAFF"/>
           </w:tcPr>
@@ -3854,7 +3861,7 @@
         </w:tc>
         <w:tc>
           <w:tcPr>
-            <w:tcW w:w="850" w:type="dxa"/>
+            <w:tcW w:w="1323" w:type="dxa"/>
             <w:vMerge/>
             <w:shd w:val="clear" w:color="auto" w:fill="B5DAFF"/>
           </w:tcPr>
@@ -3873,8 +3880,8 @@
         </w:tc>
         <w:tc>
           <w:tcPr>
-            <w:tcW w:w="4111" w:type="dxa"/>
-            <w:gridSpan w:val="2"/>
+            <w:tcW w:w="3940" w:type="dxa"/>
+            <w:gridSpan w:val="3"/>
             <w:shd w:val="clear" w:color="auto" w:fill="B5DAFF"/>
           </w:tcPr>
           <w:p>
@@ -3889,6 +3896,8 @@
       </w:tr>
       <w:tr>
         <w:trPr>
+          <w:gridAfter w:val="1"/>
+          <w:wAfter w:w="14" w:type="dxa"/>
           <w:trHeight w:val="907"/>
           <w:jc w:val="center"/>
         </w:trPr>
@@ -3959,6 +3968,14 @@
                 <w:lang w:val="en-AU"/>
               </w:rPr>
             </w:pPr>
+            <w:r>
+              <w:rPr>
+                <w:rFonts w:ascii="Calibri" w:hAnsi="Calibri" w:cs="Times New Roman"/>
+                <w:color w:val="auto"/>
+                <w:lang w:val="en-AU"/>
+              </w:rPr>
+              <w:t>High</w:t>
+            </w:r>
           </w:p>
         </w:tc>
         <w:tc>
@@ -3977,11 +3994,19 @@
                 <w:lang w:val="en-AU"/>
               </w:rPr>
             </w:pPr>
-          </w:p>
-        </w:tc>
-        <w:tc>
-          <w:tcPr>
-            <w:tcW w:w="992" w:type="dxa"/>
+            <w:r>
+              <w:rPr>
+                <w:rFonts w:ascii="Calibri" w:hAnsi="Calibri" w:cs="Times New Roman"/>
+                <w:color w:val="auto"/>
+                <w:lang w:val="en-AU"/>
+              </w:rPr>
+              <w:t>Get the affected person to get up and go for a walk break to rest their eyes</w:t>
+            </w:r>
+          </w:p>
+        </w:tc>
+        <w:tc>
+          <w:tcPr>
+            <w:tcW w:w="1398" w:type="dxa"/>
           </w:tcPr>
           <w:p>
             <w:pPr>
@@ -3994,11 +4019,19 @@
                 <w:lang w:val="en-AU"/>
               </w:rPr>
             </w:pPr>
-          </w:p>
-        </w:tc>
-        <w:tc>
-          <w:tcPr>
-            <w:tcW w:w="850" w:type="dxa"/>
+            <w:r>
+              <w:rPr>
+                <w:rFonts w:ascii="Calibri" w:hAnsi="Calibri" w:cs="Times New Roman"/>
+                <w:color w:val="auto"/>
+                <w:lang w:val="en-AU"/>
+              </w:rPr>
+              <w:t>The person affected by it</w:t>
+            </w:r>
+          </w:p>
+        </w:tc>
+        <w:tc>
+          <w:tcPr>
+            <w:tcW w:w="1323" w:type="dxa"/>
           </w:tcPr>
           <w:p>
             <w:pPr>
@@ -4011,12 +4044,20 @@
                 <w:lang w:val="en-AU"/>
               </w:rPr>
             </w:pPr>
-          </w:p>
-        </w:tc>
-        <w:tc>
-          <w:tcPr>
-            <w:tcW w:w="4111" w:type="dxa"/>
-            <w:gridSpan w:val="2"/>
+            <w:r>
+              <w:rPr>
+                <w:rFonts w:ascii="Calibri" w:hAnsi="Calibri" w:cs="Times New Roman"/>
+                <w:color w:val="auto"/>
+                <w:lang w:val="en-AU"/>
+              </w:rPr>
+              <w:t>When eyes are strained</w:t>
+            </w:r>
+          </w:p>
+        </w:tc>
+        <w:tc>
+          <w:tcPr>
+            <w:tcW w:w="3940" w:type="dxa"/>
+            <w:gridSpan w:val="3"/>
           </w:tcPr>
           <w:p>
             <w:pPr>
@@ -4029,11 +4070,21 @@
                 <w:lang w:val="en-AU"/>
               </w:rPr>
             </w:pPr>
+            <w:r>
+              <w:rPr>
+                <w:rFonts w:ascii="Calibri" w:hAnsi="Calibri" w:cs="Times New Roman"/>
+                <w:color w:val="auto"/>
+                <w:lang w:val="en-AU"/>
+              </w:rPr>
+              <w:t>Medium</w:t>
+            </w:r>
           </w:p>
         </w:tc>
       </w:tr>
       <w:tr>
         <w:trPr>
+          <w:gridAfter w:val="1"/>
+          <w:wAfter w:w="14" w:type="dxa"/>
           <w:trHeight w:val="907"/>
           <w:jc w:val="center"/>
         </w:trPr>
@@ -4078,6 +4129,14 @@
                 <w:lang w:val="en-AU"/>
               </w:rPr>
             </w:pPr>
+            <w:r>
+              <w:rPr>
+                <w:rFonts w:ascii="Calibri" w:hAnsi="Calibri" w:cs="Times New Roman"/>
+                <w:color w:val="auto"/>
+                <w:lang w:val="en-AU"/>
+              </w:rPr>
+              <w:t>Spilling the coffee and getting burned or slipping</w:t>
+            </w:r>
           </w:p>
         </w:tc>
         <w:tc>
@@ -4096,6 +4155,14 @@
                 <w:lang w:val="en-AU"/>
               </w:rPr>
             </w:pPr>
+            <w:r>
+              <w:rPr>
+                <w:rFonts w:ascii="Calibri" w:hAnsi="Calibri" w:cs="Times New Roman"/>
+                <w:color w:val="auto"/>
+                <w:lang w:val="en-AU"/>
+              </w:rPr>
+              <w:t>Medium</w:t>
+            </w:r>
           </w:p>
         </w:tc>
         <w:tc>
@@ -4114,11 +4181,19 @@
                 <w:lang w:val="en-AU"/>
               </w:rPr>
             </w:pPr>
-          </w:p>
-        </w:tc>
-        <w:tc>
-          <w:tcPr>
-            <w:tcW w:w="992" w:type="dxa"/>
+            <w:r>
+              <w:rPr>
+                <w:rFonts w:ascii="Calibri" w:hAnsi="Calibri" w:cs="Times New Roman"/>
+                <w:color w:val="auto"/>
+                <w:lang w:val="en-AU"/>
+              </w:rPr>
+              <w:t>Clean up the spillage as soon as possible</w:t>
+            </w:r>
+          </w:p>
+        </w:tc>
+        <w:tc>
+          <w:tcPr>
+            <w:tcW w:w="1398" w:type="dxa"/>
           </w:tcPr>
           <w:p>
             <w:pPr>
@@ -4131,11 +4206,19 @@
                 <w:lang w:val="en-AU"/>
               </w:rPr>
             </w:pPr>
-          </w:p>
-        </w:tc>
-        <w:tc>
-          <w:tcPr>
-            <w:tcW w:w="850" w:type="dxa"/>
+            <w:r>
+              <w:rPr>
+                <w:rFonts w:ascii="Calibri" w:hAnsi="Calibri" w:cs="Times New Roman"/>
+                <w:color w:val="auto"/>
+                <w:lang w:val="en-AU"/>
+              </w:rPr>
+              <w:t>The person who spills</w:t>
+            </w:r>
+          </w:p>
+        </w:tc>
+        <w:tc>
+          <w:tcPr>
+            <w:tcW w:w="1323" w:type="dxa"/>
           </w:tcPr>
           <w:p>
             <w:pPr>
@@ -4148,12 +4231,20 @@
                 <w:lang w:val="en-AU"/>
               </w:rPr>
             </w:pPr>
-          </w:p>
-        </w:tc>
-        <w:tc>
-          <w:tcPr>
-            <w:tcW w:w="4111" w:type="dxa"/>
-            <w:gridSpan w:val="2"/>
+            <w:r>
+              <w:rPr>
+                <w:rFonts w:ascii="Calibri" w:hAnsi="Calibri" w:cs="Times New Roman"/>
+                <w:color w:val="auto"/>
+                <w:lang w:val="en-AU"/>
+              </w:rPr>
+              <w:t>Now</w:t>
+            </w:r>
+          </w:p>
+        </w:tc>
+        <w:tc>
+          <w:tcPr>
+            <w:tcW w:w="3940" w:type="dxa"/>
+            <w:gridSpan w:val="3"/>
           </w:tcPr>
           <w:p>
             <w:pPr>
@@ -4166,11 +4257,21 @@
                 <w:lang w:val="en-AU"/>
               </w:rPr>
             </w:pPr>
+            <w:r>
+              <w:rPr>
+                <w:rFonts w:ascii="Calibri" w:hAnsi="Calibri" w:cs="Times New Roman"/>
+                <w:color w:val="auto"/>
+                <w:lang w:val="en-AU"/>
+              </w:rPr>
+              <w:t>Very Low</w:t>
+            </w:r>
           </w:p>
         </w:tc>
       </w:tr>
       <w:tr>
         <w:trPr>
+          <w:gridAfter w:val="1"/>
+          <w:wAfter w:w="14" w:type="dxa"/>
           <w:trHeight w:val="907"/>
           <w:jc w:val="center"/>
         </w:trPr>
@@ -4267,11 +4368,19 @@
                 <w:lang w:val="en-AU"/>
               </w:rPr>
             </w:pPr>
-          </w:p>
-        </w:tc>
-        <w:tc>
-          <w:tcPr>
-            <w:tcW w:w="992" w:type="dxa"/>
+            <w:r>
+              <w:rPr>
+                <w:rFonts w:ascii="Calibri" w:hAnsi="Calibri" w:cs="Times New Roman"/>
+                <w:color w:val="auto"/>
+                <w:lang w:val="en-AU"/>
+              </w:rPr>
+              <w:t>Close the software</w:t>
+            </w:r>
+          </w:p>
+        </w:tc>
+        <w:tc>
+          <w:tcPr>
+            <w:tcW w:w="1398" w:type="dxa"/>
           </w:tcPr>
           <w:p>
             <w:pPr>
@@ -4284,11 +4393,19 @@
                 <w:lang w:val="en-AU"/>
               </w:rPr>
             </w:pPr>
-          </w:p>
-        </w:tc>
-        <w:tc>
-          <w:tcPr>
-            <w:tcW w:w="850" w:type="dxa"/>
+            <w:r>
+              <w:rPr>
+                <w:rFonts w:ascii="Calibri" w:hAnsi="Calibri" w:cs="Times New Roman"/>
+                <w:color w:val="auto"/>
+                <w:lang w:val="en-AU"/>
+              </w:rPr>
+              <w:t>The distracted Person</w:t>
+            </w:r>
+          </w:p>
+        </w:tc>
+        <w:tc>
+          <w:tcPr>
+            <w:tcW w:w="1323" w:type="dxa"/>
           </w:tcPr>
           <w:p>
             <w:pPr>
@@ -4301,12 +4418,20 @@
                 <w:lang w:val="en-AU"/>
               </w:rPr>
             </w:pPr>
-          </w:p>
-        </w:tc>
-        <w:tc>
-          <w:tcPr>
-            <w:tcW w:w="4111" w:type="dxa"/>
-            <w:gridSpan w:val="2"/>
+            <w:r>
+              <w:rPr>
+                <w:rFonts w:ascii="Calibri" w:hAnsi="Calibri" w:cs="Times New Roman"/>
+                <w:color w:val="auto"/>
+                <w:lang w:val="en-AU"/>
+              </w:rPr>
+              <w:t>When distracted</w:t>
+            </w:r>
+          </w:p>
+        </w:tc>
+        <w:tc>
+          <w:tcPr>
+            <w:tcW w:w="3940" w:type="dxa"/>
+            <w:gridSpan w:val="3"/>
           </w:tcPr>
           <w:p>
             <w:pPr>
@@ -4319,264 +4444,14 @@
                 <w:lang w:val="en-AU"/>
               </w:rPr>
             </w:pPr>
-          </w:p>
-        </w:tc>
-      </w:tr>
-      <w:tr>
-        <w:trPr>
-          <w:trHeight w:val="907"/>
-          <w:jc w:val="center"/>
-        </w:trPr>
-        <w:tc>
-          <w:tcPr>
-            <w:tcW w:w="1972" w:type="dxa"/>
-            <w:gridSpan w:val="2"/>
-          </w:tcPr>
-          <w:p>
-            <w:pPr>
-              <w:pStyle w:val="NoParagraphStyle"/>
-              <w:spacing w:line="240" w:lineRule="auto"/>
-              <w:textAlignment w:val="auto"/>
-              <w:rPr>
-                <w:rFonts w:ascii="Calibri" w:hAnsi="Calibri" w:cs="Times New Roman"/>
-                <w:color w:val="auto"/>
-                <w:lang w:val="en-AU"/>
-              </w:rPr>
-            </w:pPr>
-          </w:p>
-        </w:tc>
-        <w:tc>
-          <w:tcPr>
-            <w:tcW w:w="2105" w:type="dxa"/>
-          </w:tcPr>
-          <w:p>
-            <w:pPr>
-              <w:pStyle w:val="NoParagraphStyle"/>
-              <w:spacing w:line="240" w:lineRule="auto"/>
-              <w:textAlignment w:val="auto"/>
-              <w:rPr>
-                <w:rFonts w:ascii="Calibri" w:hAnsi="Calibri" w:cs="Times New Roman"/>
-                <w:color w:val="auto"/>
-                <w:lang w:val="en-AU"/>
-              </w:rPr>
-            </w:pPr>
-          </w:p>
-        </w:tc>
-        <w:tc>
-          <w:tcPr>
-            <w:tcW w:w="2268" w:type="dxa"/>
-            <w:gridSpan w:val="2"/>
-          </w:tcPr>
-          <w:p>
-            <w:pPr>
-              <w:pStyle w:val="NoParagraphStyle"/>
-              <w:spacing w:line="240" w:lineRule="auto"/>
-              <w:textAlignment w:val="auto"/>
-              <w:rPr>
-                <w:rFonts w:ascii="Calibri" w:hAnsi="Calibri" w:cs="Times New Roman"/>
-                <w:color w:val="auto"/>
-                <w:lang w:val="en-AU"/>
-              </w:rPr>
-            </w:pPr>
-          </w:p>
-        </w:tc>
-        <w:tc>
-          <w:tcPr>
-            <w:tcW w:w="2694" w:type="dxa"/>
-            <w:gridSpan w:val="2"/>
-          </w:tcPr>
-          <w:p>
-            <w:pPr>
-              <w:pStyle w:val="NoParagraphStyle"/>
-              <w:spacing w:line="240" w:lineRule="auto"/>
-              <w:textAlignment w:val="auto"/>
-              <w:rPr>
-                <w:rFonts w:ascii="Calibri" w:hAnsi="Calibri" w:cs="Times New Roman"/>
-                <w:color w:val="auto"/>
-                <w:lang w:val="en-AU"/>
-              </w:rPr>
-            </w:pPr>
-          </w:p>
-        </w:tc>
-        <w:tc>
-          <w:tcPr>
-            <w:tcW w:w="992" w:type="dxa"/>
-          </w:tcPr>
-          <w:p>
-            <w:pPr>
-              <w:pStyle w:val="NoParagraphStyle"/>
-              <w:spacing w:line="240" w:lineRule="auto"/>
-              <w:textAlignment w:val="auto"/>
-              <w:rPr>
-                <w:rFonts w:ascii="Calibri" w:hAnsi="Calibri" w:cs="Times New Roman"/>
-                <w:color w:val="auto"/>
-                <w:lang w:val="en-AU"/>
-              </w:rPr>
-            </w:pPr>
-          </w:p>
-        </w:tc>
-        <w:tc>
-          <w:tcPr>
-            <w:tcW w:w="850" w:type="dxa"/>
-          </w:tcPr>
-          <w:p>
-            <w:pPr>
-              <w:pStyle w:val="NoParagraphStyle"/>
-              <w:spacing w:line="240" w:lineRule="auto"/>
-              <w:textAlignment w:val="auto"/>
-              <w:rPr>
-                <w:rFonts w:ascii="Calibri" w:hAnsi="Calibri" w:cs="Times New Roman"/>
-                <w:color w:val="auto"/>
-                <w:lang w:val="en-AU"/>
-              </w:rPr>
-            </w:pPr>
-          </w:p>
-        </w:tc>
-        <w:tc>
-          <w:tcPr>
-            <w:tcW w:w="4111" w:type="dxa"/>
-            <w:gridSpan w:val="2"/>
-          </w:tcPr>
-          <w:p>
-            <w:pPr>
-              <w:pStyle w:val="NoParagraphStyle"/>
-              <w:spacing w:line="240" w:lineRule="auto"/>
-              <w:textAlignment w:val="auto"/>
-              <w:rPr>
-                <w:rFonts w:ascii="Calibri" w:hAnsi="Calibri" w:cs="Times New Roman"/>
-                <w:color w:val="auto"/>
-                <w:lang w:val="en-AU"/>
-              </w:rPr>
-            </w:pPr>
-          </w:p>
-        </w:tc>
-      </w:tr>
-      <w:tr>
-        <w:trPr>
-          <w:trHeight w:val="907"/>
-          <w:jc w:val="center"/>
-        </w:trPr>
-        <w:tc>
-          <w:tcPr>
-            <w:tcW w:w="1972" w:type="dxa"/>
-            <w:gridSpan w:val="2"/>
-          </w:tcPr>
-          <w:p>
-            <w:pPr>
-              <w:pStyle w:val="NoParagraphStyle"/>
-              <w:spacing w:line="240" w:lineRule="auto"/>
-              <w:textAlignment w:val="auto"/>
-              <w:rPr>
-                <w:rFonts w:ascii="Calibri" w:hAnsi="Calibri" w:cs="Times New Roman"/>
-                <w:color w:val="auto"/>
-                <w:lang w:val="en-AU"/>
-              </w:rPr>
-            </w:pPr>
-          </w:p>
-        </w:tc>
-        <w:tc>
-          <w:tcPr>
-            <w:tcW w:w="2105" w:type="dxa"/>
-          </w:tcPr>
-          <w:p>
-            <w:pPr>
-              <w:pStyle w:val="NoParagraphStyle"/>
-              <w:spacing w:line="240" w:lineRule="auto"/>
-              <w:textAlignment w:val="auto"/>
-              <w:rPr>
-                <w:rFonts w:ascii="Calibri" w:hAnsi="Calibri" w:cs="Times New Roman"/>
-                <w:color w:val="auto"/>
-                <w:lang w:val="en-AU"/>
-              </w:rPr>
-            </w:pPr>
-          </w:p>
-        </w:tc>
-        <w:tc>
-          <w:tcPr>
-            <w:tcW w:w="2268" w:type="dxa"/>
-            <w:gridSpan w:val="2"/>
-          </w:tcPr>
-          <w:p>
-            <w:pPr>
-              <w:pStyle w:val="NoParagraphStyle"/>
-              <w:spacing w:line="240" w:lineRule="auto"/>
-              <w:textAlignment w:val="auto"/>
-              <w:rPr>
-                <w:rFonts w:ascii="Calibri" w:hAnsi="Calibri" w:cs="Times New Roman"/>
-                <w:color w:val="auto"/>
-                <w:lang w:val="en-AU"/>
-              </w:rPr>
-            </w:pPr>
-          </w:p>
-        </w:tc>
-        <w:tc>
-          <w:tcPr>
-            <w:tcW w:w="2694" w:type="dxa"/>
-            <w:gridSpan w:val="2"/>
-          </w:tcPr>
-          <w:p>
-            <w:pPr>
-              <w:pStyle w:val="NoParagraphStyle"/>
-              <w:spacing w:line="240" w:lineRule="auto"/>
-              <w:textAlignment w:val="auto"/>
-              <w:rPr>
-                <w:rFonts w:ascii="Calibri" w:hAnsi="Calibri" w:cs="Times New Roman"/>
-                <w:color w:val="auto"/>
-                <w:lang w:val="en-AU"/>
-              </w:rPr>
-            </w:pPr>
-          </w:p>
-        </w:tc>
-        <w:tc>
-          <w:tcPr>
-            <w:tcW w:w="992" w:type="dxa"/>
-          </w:tcPr>
-          <w:p>
-            <w:pPr>
-              <w:pStyle w:val="NoParagraphStyle"/>
-              <w:spacing w:line="240" w:lineRule="auto"/>
-              <w:textAlignment w:val="auto"/>
-              <w:rPr>
-                <w:rFonts w:ascii="Calibri" w:hAnsi="Calibri" w:cs="Times New Roman"/>
-                <w:color w:val="auto"/>
-                <w:lang w:val="en-AU"/>
-              </w:rPr>
-            </w:pPr>
-          </w:p>
-        </w:tc>
-        <w:tc>
-          <w:tcPr>
-            <w:tcW w:w="850" w:type="dxa"/>
-          </w:tcPr>
-          <w:p>
-            <w:pPr>
-              <w:pStyle w:val="NoParagraphStyle"/>
-              <w:spacing w:line="240" w:lineRule="auto"/>
-              <w:textAlignment w:val="auto"/>
-              <w:rPr>
-                <w:rFonts w:ascii="Calibri" w:hAnsi="Calibri" w:cs="Times New Roman"/>
-                <w:color w:val="auto"/>
-                <w:lang w:val="en-AU"/>
-              </w:rPr>
-            </w:pPr>
-          </w:p>
-        </w:tc>
-        <w:tc>
-          <w:tcPr>
-            <w:tcW w:w="4111" w:type="dxa"/>
-            <w:gridSpan w:val="2"/>
-          </w:tcPr>
-          <w:p>
-            <w:pPr>
-              <w:pStyle w:val="NoParagraphStyle"/>
-              <w:spacing w:line="240" w:lineRule="auto"/>
-              <w:textAlignment w:val="auto"/>
-              <w:rPr>
-                <w:rFonts w:ascii="Calibri" w:hAnsi="Calibri" w:cs="Times New Roman"/>
-                <w:color w:val="auto"/>
-                <w:lang w:val="en-AU"/>
-              </w:rPr>
-            </w:pPr>
+            <w:r>
+              <w:rPr>
+                <w:rFonts w:ascii="Calibri" w:hAnsi="Calibri" w:cs="Times New Roman"/>
+                <w:color w:val="auto"/>
+                <w:lang w:val="en-AU"/>
+              </w:rPr>
+              <w:t>Low</w:t>
+            </w:r>
           </w:p>
         </w:tc>
       </w:tr>
@@ -4685,6 +4560,22 @@
             <w:r>
               <w:t>Workplace:</w:t>
             </w:r>
+            <w:r>
+              <w:rPr>
+                <w:rFonts w:cs="Times New Roman"/>
+                <w:color w:val="auto"/>
+                <w:lang w:val="en-AU"/>
+              </w:rPr>
+              <w:t xml:space="preserve"> </w:t>
+            </w:r>
+            <w:r>
+              <w:rPr>
+                <w:rFonts w:cs="Times New Roman"/>
+                <w:color w:val="auto"/>
+                <w:lang w:val="en-AU"/>
+              </w:rPr>
+              <w:t>Programming Inc Headquarters</w:t>
+            </w:r>
           </w:p>
         </w:tc>
       </w:tr>
@@ -4705,6 +4596,9 @@
             <w:r>
               <w:t>Date:</w:t>
             </w:r>
+            <w:r>
+              <w:t xml:space="preserve"> 19/02/2026</w:t>
+            </w:r>
           </w:p>
         </w:tc>
         <w:tc>
@@ -4718,6 +4612,17 @@
             </w:pPr>
             <w:r>
               <w:t>Completed by:</w:t>
+            </w:r>
+            <w:r>
+              <w:t xml:space="preserve"> </w:t>
+            </w:r>
+            <w:r>
+              <w:rPr>
+                <w:rFonts w:cs="Times New Roman"/>
+                <w:color w:val="auto"/>
+                <w:lang w:val="en-AU"/>
+              </w:rPr>
+              <w:t>29/02/2026</w:t>
             </w:r>
           </w:p>
         </w:tc>
@@ -4842,6 +4747,14 @@
                 <w:lang w:val="en-AU"/>
               </w:rPr>
             </w:pPr>
+            <w:r>
+              <w:rPr>
+                <w:rFonts w:ascii="Calibri" w:hAnsi="Calibri" w:cs="Times New Roman"/>
+                <w:color w:val="auto"/>
+                <w:lang w:val="en-AU"/>
+              </w:rPr>
+              <w:t>Elimination</w:t>
+            </w:r>
           </w:p>
         </w:tc>
         <w:tc>
@@ -4859,6 +4772,14 @@
                 <w:lang w:val="en-AU"/>
               </w:rPr>
             </w:pPr>
+            <w:r>
+              <w:rPr>
+                <w:rFonts w:ascii="Calibri" w:hAnsi="Calibri" w:cs="Times New Roman"/>
+                <w:color w:val="auto"/>
+                <w:lang w:val="en-AU"/>
+              </w:rPr>
+              <w:t>WHS Training</w:t>
+            </w:r>
           </w:p>
         </w:tc>
         <w:tc>
@@ -4876,6 +4797,14 @@
                 <w:lang w:val="en-AU"/>
               </w:rPr>
             </w:pPr>
+            <w:r>
+              <w:rPr>
+                <w:rFonts w:ascii="Calibri" w:hAnsi="Calibri" w:cs="Times New Roman"/>
+                <w:color w:val="auto"/>
+                <w:lang w:val="en-AU"/>
+              </w:rPr>
+              <w:t>John Doe</w:t>
+            </w:r>
           </w:p>
         </w:tc>
         <w:tc>
@@ -4893,6 +4822,14 @@
                 <w:lang w:val="en-AU"/>
               </w:rPr>
             </w:pPr>
+            <w:r>
+              <w:rPr>
+                <w:rFonts w:ascii="Calibri" w:hAnsi="Calibri" w:cs="Times New Roman"/>
+                <w:color w:val="auto"/>
+                <w:lang w:val="en-AU"/>
+              </w:rPr>
+              <w:t>We will teach him how to properly dispose of dangerous substances and things that pose risk</w:t>
+            </w:r>
           </w:p>
         </w:tc>
         <w:tc>
@@ -4910,6 +4847,14 @@
                 <w:lang w:val="en-AU"/>
               </w:rPr>
             </w:pPr>
+            <w:r>
+              <w:rPr>
+                <w:rFonts w:ascii="Calibri" w:hAnsi="Calibri" w:cs="Times New Roman"/>
+                <w:color w:val="auto"/>
+                <w:lang w:val="en-AU"/>
+              </w:rPr>
+              <w:t>29/02/2026</w:t>
+            </w:r>
           </w:p>
         </w:tc>
       </w:tr>
@@ -4933,6 +4878,14 @@
                 <w:lang w:val="en-AU"/>
               </w:rPr>
             </w:pPr>
+            <w:r>
+              <w:rPr>
+                <w:rFonts w:ascii="Calibri" w:hAnsi="Calibri" w:cs="Times New Roman"/>
+                <w:color w:val="auto"/>
+                <w:lang w:val="en-AU"/>
+              </w:rPr>
+              <w:t>Substitution</w:t>
+            </w:r>
           </w:p>
         </w:tc>
         <w:tc>
@@ -4950,6 +4903,14 @@
                 <w:lang w:val="en-AU"/>
               </w:rPr>
             </w:pPr>
+            <w:r>
+              <w:rPr>
+                <w:rFonts w:ascii="Calibri" w:hAnsi="Calibri" w:cs="Times New Roman"/>
+                <w:color w:val="auto"/>
+                <w:lang w:val="en-AU"/>
+              </w:rPr>
+              <w:t>WHS Training</w:t>
+            </w:r>
           </w:p>
         </w:tc>
         <w:tc>
@@ -4967,6 +4928,14 @@
                 <w:lang w:val="en-AU"/>
               </w:rPr>
             </w:pPr>
+            <w:r>
+              <w:rPr>
+                <w:rFonts w:ascii="Calibri" w:hAnsi="Calibri" w:cs="Times New Roman"/>
+                <w:color w:val="auto"/>
+                <w:lang w:val="en-AU"/>
+              </w:rPr>
+              <w:t>Jane Doe</w:t>
+            </w:r>
           </w:p>
         </w:tc>
         <w:tc>
@@ -4984,6 +4953,14 @@
                 <w:lang w:val="en-AU"/>
               </w:rPr>
             </w:pPr>
+            <w:r>
+              <w:rPr>
+                <w:rFonts w:ascii="Calibri" w:hAnsi="Calibri" w:cs="Times New Roman"/>
+                <w:color w:val="auto"/>
+                <w:lang w:val="en-AU"/>
+              </w:rPr>
+              <w:t>We will teach her what dangerous substances have safe alternatives to turn to.</w:t>
+            </w:r>
           </w:p>
         </w:tc>
         <w:tc>
@@ -5001,6 +4978,14 @@
                 <w:lang w:val="en-AU"/>
               </w:rPr>
             </w:pPr>
+            <w:r>
+              <w:rPr>
+                <w:rFonts w:ascii="Calibri" w:hAnsi="Calibri" w:cs="Times New Roman"/>
+                <w:color w:val="auto"/>
+                <w:lang w:val="en-AU"/>
+              </w:rPr>
+              <w:t>29/02/2026</w:t>
+            </w:r>
           </w:p>
         </w:tc>
       </w:tr>
@@ -5024,6 +5009,14 @@
                 <w:lang w:val="en-AU"/>
               </w:rPr>
             </w:pPr>
+            <w:r>
+              <w:rPr>
+                <w:rFonts w:ascii="Calibri" w:hAnsi="Calibri" w:cs="Times New Roman"/>
+                <w:color w:val="auto"/>
+                <w:lang w:val="en-AU"/>
+              </w:rPr>
+              <w:t>Personal Protective Equipment</w:t>
+            </w:r>
           </w:p>
         </w:tc>
         <w:tc>
@@ -5041,6 +5034,14 @@
                 <w:lang w:val="en-AU"/>
               </w:rPr>
             </w:pPr>
+            <w:r>
+              <w:rPr>
+                <w:rFonts w:ascii="Calibri" w:hAnsi="Calibri" w:cs="Times New Roman"/>
+                <w:color w:val="auto"/>
+                <w:lang w:val="en-AU"/>
+              </w:rPr>
+              <w:t>WHS Training</w:t>
+            </w:r>
           </w:p>
         </w:tc>
         <w:tc>
@@ -5058,6 +5059,14 @@
                 <w:lang w:val="en-AU"/>
               </w:rPr>
             </w:pPr>
+            <w:r>
+              <w:rPr>
+                <w:rFonts w:ascii="Calibri" w:hAnsi="Calibri" w:cs="Times New Roman"/>
+                <w:color w:val="auto"/>
+                <w:lang w:val="en-AU"/>
+              </w:rPr>
+              <w:t>Joe Bloggs</w:t>
+            </w:r>
           </w:p>
         </w:tc>
         <w:tc>
@@ -5075,6 +5084,14 @@
                 <w:lang w:val="en-AU"/>
               </w:rPr>
             </w:pPr>
+            <w:r>
+              <w:rPr>
+                <w:rFonts w:ascii="Calibri" w:hAnsi="Calibri" w:cs="Times New Roman"/>
+                <w:color w:val="auto"/>
+                <w:lang w:val="en-AU"/>
+              </w:rPr>
+              <w:t>We will teach him about what protective gear he should wear and when he needs to wear it in the workplace</w:t>
+            </w:r>
           </w:p>
         </w:tc>
         <w:tc>
@@ -5092,825 +5109,14 @@
                 <w:lang w:val="en-AU"/>
               </w:rPr>
             </w:pPr>
-          </w:p>
-        </w:tc>
-      </w:tr>
-      <w:tr>
-        <w:trPr>
-          <w:trHeight w:val="418"/>
-          <w:jc w:val="center"/>
-        </w:trPr>
-        <w:tc>
-          <w:tcPr>
-            <w:tcW w:w="1809" w:type="dxa"/>
-          </w:tcPr>
-          <w:p>
-            <w:pPr>
-              <w:pStyle w:val="NoParagraphStyle"/>
-              <w:spacing w:line="240" w:lineRule="auto"/>
-              <w:textAlignment w:val="auto"/>
-              <w:rPr>
-                <w:rFonts w:ascii="Calibri" w:hAnsi="Calibri" w:cs="Times New Roman"/>
-                <w:color w:val="auto"/>
-                <w:lang w:val="en-AU"/>
-              </w:rPr>
-            </w:pPr>
-          </w:p>
-        </w:tc>
-        <w:tc>
-          <w:tcPr>
-            <w:tcW w:w="1843" w:type="dxa"/>
-          </w:tcPr>
-          <w:p>
-            <w:pPr>
-              <w:pStyle w:val="NoParagraphStyle"/>
-              <w:spacing w:line="240" w:lineRule="auto"/>
-              <w:textAlignment w:val="auto"/>
-              <w:rPr>
-                <w:rFonts w:ascii="Calibri" w:hAnsi="Calibri" w:cs="Times New Roman"/>
-                <w:color w:val="auto"/>
-                <w:lang w:val="en-AU"/>
-              </w:rPr>
-            </w:pPr>
-          </w:p>
-        </w:tc>
-        <w:tc>
-          <w:tcPr>
-            <w:tcW w:w="1418" w:type="dxa"/>
-          </w:tcPr>
-          <w:p>
-            <w:pPr>
-              <w:pStyle w:val="NoParagraphStyle"/>
-              <w:spacing w:line="240" w:lineRule="auto"/>
-              <w:textAlignment w:val="auto"/>
-              <w:rPr>
-                <w:rFonts w:ascii="Calibri" w:hAnsi="Calibri" w:cs="Times New Roman"/>
-                <w:color w:val="auto"/>
-                <w:lang w:val="en-AU"/>
-              </w:rPr>
-            </w:pPr>
-          </w:p>
-        </w:tc>
-        <w:tc>
-          <w:tcPr>
-            <w:tcW w:w="2693" w:type="dxa"/>
-          </w:tcPr>
-          <w:p>
-            <w:pPr>
-              <w:pStyle w:val="NoParagraphStyle"/>
-              <w:spacing w:line="240" w:lineRule="auto"/>
-              <w:textAlignment w:val="auto"/>
-              <w:rPr>
-                <w:rFonts w:ascii="Calibri" w:hAnsi="Calibri" w:cs="Times New Roman"/>
-                <w:color w:val="auto"/>
-                <w:lang w:val="en-AU"/>
-              </w:rPr>
-            </w:pPr>
-          </w:p>
-        </w:tc>
-        <w:tc>
-          <w:tcPr>
-            <w:tcW w:w="2268" w:type="dxa"/>
-          </w:tcPr>
-          <w:p>
-            <w:pPr>
-              <w:pStyle w:val="NoParagraphStyle"/>
-              <w:spacing w:line="240" w:lineRule="auto"/>
-              <w:textAlignment w:val="auto"/>
-              <w:rPr>
-                <w:rFonts w:ascii="Calibri" w:hAnsi="Calibri" w:cs="Times New Roman"/>
-                <w:color w:val="auto"/>
-                <w:lang w:val="en-AU"/>
-              </w:rPr>
-            </w:pPr>
-          </w:p>
-        </w:tc>
-      </w:tr>
-      <w:tr>
-        <w:trPr>
-          <w:trHeight w:val="418"/>
-          <w:jc w:val="center"/>
-        </w:trPr>
-        <w:tc>
-          <w:tcPr>
-            <w:tcW w:w="1809" w:type="dxa"/>
-          </w:tcPr>
-          <w:p>
-            <w:pPr>
-              <w:pStyle w:val="NoParagraphStyle"/>
-              <w:spacing w:line="240" w:lineRule="auto"/>
-              <w:textAlignment w:val="auto"/>
-              <w:rPr>
-                <w:rFonts w:ascii="Calibri" w:hAnsi="Calibri" w:cs="Times New Roman"/>
-                <w:color w:val="auto"/>
-                <w:lang w:val="en-AU"/>
-              </w:rPr>
-            </w:pPr>
-          </w:p>
-        </w:tc>
-        <w:tc>
-          <w:tcPr>
-            <w:tcW w:w="1843" w:type="dxa"/>
-          </w:tcPr>
-          <w:p>
-            <w:pPr>
-              <w:pStyle w:val="NoParagraphStyle"/>
-              <w:spacing w:line="240" w:lineRule="auto"/>
-              <w:textAlignment w:val="auto"/>
-              <w:rPr>
-                <w:rFonts w:ascii="Calibri" w:hAnsi="Calibri" w:cs="Times New Roman"/>
-                <w:color w:val="auto"/>
-                <w:lang w:val="en-AU"/>
-              </w:rPr>
-            </w:pPr>
-          </w:p>
-        </w:tc>
-        <w:tc>
-          <w:tcPr>
-            <w:tcW w:w="1418" w:type="dxa"/>
-          </w:tcPr>
-          <w:p>
-            <w:pPr>
-              <w:pStyle w:val="NoParagraphStyle"/>
-              <w:spacing w:line="240" w:lineRule="auto"/>
-              <w:textAlignment w:val="auto"/>
-              <w:rPr>
-                <w:rFonts w:ascii="Calibri" w:hAnsi="Calibri" w:cs="Times New Roman"/>
-                <w:color w:val="auto"/>
-                <w:lang w:val="en-AU"/>
-              </w:rPr>
-            </w:pPr>
-          </w:p>
-        </w:tc>
-        <w:tc>
-          <w:tcPr>
-            <w:tcW w:w="2693" w:type="dxa"/>
-          </w:tcPr>
-          <w:p>
-            <w:pPr>
-              <w:pStyle w:val="NoParagraphStyle"/>
-              <w:spacing w:line="240" w:lineRule="auto"/>
-              <w:textAlignment w:val="auto"/>
-              <w:rPr>
-                <w:rFonts w:ascii="Calibri" w:hAnsi="Calibri" w:cs="Times New Roman"/>
-                <w:color w:val="auto"/>
-                <w:lang w:val="en-AU"/>
-              </w:rPr>
-            </w:pPr>
-          </w:p>
-        </w:tc>
-        <w:tc>
-          <w:tcPr>
-            <w:tcW w:w="2268" w:type="dxa"/>
-          </w:tcPr>
-          <w:p>
-            <w:pPr>
-              <w:pStyle w:val="NoParagraphStyle"/>
-              <w:spacing w:line="240" w:lineRule="auto"/>
-              <w:textAlignment w:val="auto"/>
-              <w:rPr>
-                <w:rFonts w:ascii="Calibri" w:hAnsi="Calibri" w:cs="Times New Roman"/>
-                <w:color w:val="auto"/>
-                <w:lang w:val="en-AU"/>
-              </w:rPr>
-            </w:pPr>
-          </w:p>
-        </w:tc>
-      </w:tr>
-      <w:tr>
-        <w:trPr>
-          <w:trHeight w:val="418"/>
-          <w:jc w:val="center"/>
-        </w:trPr>
-        <w:tc>
-          <w:tcPr>
-            <w:tcW w:w="1809" w:type="dxa"/>
-          </w:tcPr>
-          <w:p>
-            <w:pPr>
-              <w:pStyle w:val="NoParagraphStyle"/>
-              <w:spacing w:line="240" w:lineRule="auto"/>
-              <w:textAlignment w:val="auto"/>
-              <w:rPr>
-                <w:rFonts w:ascii="Calibri" w:hAnsi="Calibri" w:cs="Times New Roman"/>
-                <w:color w:val="auto"/>
-                <w:lang w:val="en-AU"/>
-              </w:rPr>
-            </w:pPr>
-          </w:p>
-        </w:tc>
-        <w:tc>
-          <w:tcPr>
-            <w:tcW w:w="1843" w:type="dxa"/>
-          </w:tcPr>
-          <w:p>
-            <w:pPr>
-              <w:pStyle w:val="NoParagraphStyle"/>
-              <w:spacing w:line="240" w:lineRule="auto"/>
-              <w:textAlignment w:val="auto"/>
-              <w:rPr>
-                <w:rFonts w:ascii="Calibri" w:hAnsi="Calibri" w:cs="Times New Roman"/>
-                <w:color w:val="auto"/>
-                <w:lang w:val="en-AU"/>
-              </w:rPr>
-            </w:pPr>
-          </w:p>
-        </w:tc>
-        <w:tc>
-          <w:tcPr>
-            <w:tcW w:w="1418" w:type="dxa"/>
-          </w:tcPr>
-          <w:p>
-            <w:pPr>
-              <w:pStyle w:val="NoParagraphStyle"/>
-              <w:spacing w:line="240" w:lineRule="auto"/>
-              <w:textAlignment w:val="auto"/>
-              <w:rPr>
-                <w:rFonts w:ascii="Calibri" w:hAnsi="Calibri" w:cs="Times New Roman"/>
-                <w:color w:val="auto"/>
-                <w:lang w:val="en-AU"/>
-              </w:rPr>
-            </w:pPr>
-          </w:p>
-        </w:tc>
-        <w:tc>
-          <w:tcPr>
-            <w:tcW w:w="2693" w:type="dxa"/>
-          </w:tcPr>
-          <w:p>
-            <w:pPr>
-              <w:pStyle w:val="NoParagraphStyle"/>
-              <w:spacing w:line="240" w:lineRule="auto"/>
-              <w:textAlignment w:val="auto"/>
-              <w:rPr>
-                <w:rFonts w:ascii="Calibri" w:hAnsi="Calibri" w:cs="Times New Roman"/>
-                <w:color w:val="auto"/>
-                <w:lang w:val="en-AU"/>
-              </w:rPr>
-            </w:pPr>
-          </w:p>
-        </w:tc>
-        <w:tc>
-          <w:tcPr>
-            <w:tcW w:w="2268" w:type="dxa"/>
-          </w:tcPr>
-          <w:p>
-            <w:pPr>
-              <w:pStyle w:val="NoParagraphStyle"/>
-              <w:spacing w:line="240" w:lineRule="auto"/>
-              <w:textAlignment w:val="auto"/>
-              <w:rPr>
-                <w:rFonts w:ascii="Calibri" w:hAnsi="Calibri" w:cs="Times New Roman"/>
-                <w:color w:val="auto"/>
-                <w:lang w:val="en-AU"/>
-              </w:rPr>
-            </w:pPr>
-          </w:p>
-        </w:tc>
-      </w:tr>
-      <w:tr>
-        <w:trPr>
-          <w:trHeight w:val="418"/>
-          <w:jc w:val="center"/>
-        </w:trPr>
-        <w:tc>
-          <w:tcPr>
-            <w:tcW w:w="1809" w:type="dxa"/>
-          </w:tcPr>
-          <w:p>
-            <w:pPr>
-              <w:pStyle w:val="NoParagraphStyle"/>
-              <w:spacing w:line="240" w:lineRule="auto"/>
-              <w:textAlignment w:val="auto"/>
-              <w:rPr>
-                <w:rFonts w:ascii="Calibri" w:hAnsi="Calibri" w:cs="Times New Roman"/>
-                <w:color w:val="auto"/>
-                <w:lang w:val="en-AU"/>
-              </w:rPr>
-            </w:pPr>
-          </w:p>
-        </w:tc>
-        <w:tc>
-          <w:tcPr>
-            <w:tcW w:w="1843" w:type="dxa"/>
-          </w:tcPr>
-          <w:p>
-            <w:pPr>
-              <w:pStyle w:val="NoParagraphStyle"/>
-              <w:spacing w:line="240" w:lineRule="auto"/>
-              <w:textAlignment w:val="auto"/>
-              <w:rPr>
-                <w:rFonts w:ascii="Calibri" w:hAnsi="Calibri" w:cs="Times New Roman"/>
-                <w:color w:val="auto"/>
-                <w:lang w:val="en-AU"/>
-              </w:rPr>
-            </w:pPr>
-          </w:p>
-        </w:tc>
-        <w:tc>
-          <w:tcPr>
-            <w:tcW w:w="1418" w:type="dxa"/>
-          </w:tcPr>
-          <w:p>
-            <w:pPr>
-              <w:pStyle w:val="NoParagraphStyle"/>
-              <w:spacing w:line="240" w:lineRule="auto"/>
-              <w:textAlignment w:val="auto"/>
-              <w:rPr>
-                <w:rFonts w:ascii="Calibri" w:hAnsi="Calibri" w:cs="Times New Roman"/>
-                <w:color w:val="auto"/>
-                <w:lang w:val="en-AU"/>
-              </w:rPr>
-            </w:pPr>
-          </w:p>
-        </w:tc>
-        <w:tc>
-          <w:tcPr>
-            <w:tcW w:w="2693" w:type="dxa"/>
-          </w:tcPr>
-          <w:p>
-            <w:pPr>
-              <w:pStyle w:val="NoParagraphStyle"/>
-              <w:spacing w:line="240" w:lineRule="auto"/>
-              <w:textAlignment w:val="auto"/>
-              <w:rPr>
-                <w:rFonts w:ascii="Calibri" w:hAnsi="Calibri" w:cs="Times New Roman"/>
-                <w:color w:val="auto"/>
-                <w:lang w:val="en-AU"/>
-              </w:rPr>
-            </w:pPr>
-          </w:p>
-        </w:tc>
-        <w:tc>
-          <w:tcPr>
-            <w:tcW w:w="2268" w:type="dxa"/>
-          </w:tcPr>
-          <w:p>
-            <w:pPr>
-              <w:pStyle w:val="NoParagraphStyle"/>
-              <w:spacing w:line="240" w:lineRule="auto"/>
-              <w:textAlignment w:val="auto"/>
-              <w:rPr>
-                <w:rFonts w:ascii="Calibri" w:hAnsi="Calibri" w:cs="Times New Roman"/>
-                <w:color w:val="auto"/>
-                <w:lang w:val="en-AU"/>
-              </w:rPr>
-            </w:pPr>
-          </w:p>
-        </w:tc>
-      </w:tr>
-      <w:tr>
-        <w:trPr>
-          <w:trHeight w:val="418"/>
-          <w:jc w:val="center"/>
-        </w:trPr>
-        <w:tc>
-          <w:tcPr>
-            <w:tcW w:w="1809" w:type="dxa"/>
-          </w:tcPr>
-          <w:p>
-            <w:pPr>
-              <w:pStyle w:val="NoParagraphStyle"/>
-              <w:spacing w:line="240" w:lineRule="auto"/>
-              <w:textAlignment w:val="auto"/>
-              <w:rPr>
-                <w:rFonts w:ascii="Calibri" w:hAnsi="Calibri" w:cs="Times New Roman"/>
-                <w:color w:val="auto"/>
-                <w:lang w:val="en-AU"/>
-              </w:rPr>
-            </w:pPr>
-          </w:p>
-        </w:tc>
-        <w:tc>
-          <w:tcPr>
-            <w:tcW w:w="1843" w:type="dxa"/>
-          </w:tcPr>
-          <w:p>
-            <w:pPr>
-              <w:pStyle w:val="NoParagraphStyle"/>
-              <w:spacing w:line="240" w:lineRule="auto"/>
-              <w:textAlignment w:val="auto"/>
-              <w:rPr>
-                <w:rFonts w:ascii="Calibri" w:hAnsi="Calibri" w:cs="Times New Roman"/>
-                <w:color w:val="auto"/>
-                <w:lang w:val="en-AU"/>
-              </w:rPr>
-            </w:pPr>
-          </w:p>
-        </w:tc>
-        <w:tc>
-          <w:tcPr>
-            <w:tcW w:w="1418" w:type="dxa"/>
-          </w:tcPr>
-          <w:p>
-            <w:pPr>
-              <w:pStyle w:val="NoParagraphStyle"/>
-              <w:spacing w:line="240" w:lineRule="auto"/>
-              <w:textAlignment w:val="auto"/>
-              <w:rPr>
-                <w:rFonts w:ascii="Calibri" w:hAnsi="Calibri" w:cs="Times New Roman"/>
-                <w:color w:val="auto"/>
-                <w:lang w:val="en-AU"/>
-              </w:rPr>
-            </w:pPr>
-          </w:p>
-        </w:tc>
-        <w:tc>
-          <w:tcPr>
-            <w:tcW w:w="2693" w:type="dxa"/>
-          </w:tcPr>
-          <w:p>
-            <w:pPr>
-              <w:pStyle w:val="NoParagraphStyle"/>
-              <w:spacing w:line="240" w:lineRule="auto"/>
-              <w:textAlignment w:val="auto"/>
-              <w:rPr>
-                <w:rFonts w:ascii="Calibri" w:hAnsi="Calibri" w:cs="Times New Roman"/>
-                <w:color w:val="auto"/>
-                <w:lang w:val="en-AU"/>
-              </w:rPr>
-            </w:pPr>
-          </w:p>
-        </w:tc>
-        <w:tc>
-          <w:tcPr>
-            <w:tcW w:w="2268" w:type="dxa"/>
-          </w:tcPr>
-          <w:p>
-            <w:pPr>
-              <w:pStyle w:val="NoParagraphStyle"/>
-              <w:spacing w:line="240" w:lineRule="auto"/>
-              <w:textAlignment w:val="auto"/>
-              <w:rPr>
-                <w:rFonts w:ascii="Calibri" w:hAnsi="Calibri" w:cs="Times New Roman"/>
-                <w:color w:val="auto"/>
-                <w:lang w:val="en-AU"/>
-              </w:rPr>
-            </w:pPr>
-          </w:p>
-        </w:tc>
-      </w:tr>
-      <w:tr>
-        <w:trPr>
-          <w:trHeight w:val="418"/>
-          <w:jc w:val="center"/>
-        </w:trPr>
-        <w:tc>
-          <w:tcPr>
-            <w:tcW w:w="1809" w:type="dxa"/>
-          </w:tcPr>
-          <w:p>
-            <w:pPr>
-              <w:pStyle w:val="NoParagraphStyle"/>
-              <w:spacing w:line="240" w:lineRule="auto"/>
-              <w:textAlignment w:val="auto"/>
-              <w:rPr>
-                <w:rFonts w:ascii="Calibri" w:hAnsi="Calibri" w:cs="Times New Roman"/>
-                <w:color w:val="auto"/>
-                <w:lang w:val="en-AU"/>
-              </w:rPr>
-            </w:pPr>
-          </w:p>
-        </w:tc>
-        <w:tc>
-          <w:tcPr>
-            <w:tcW w:w="1843" w:type="dxa"/>
-          </w:tcPr>
-          <w:p>
-            <w:pPr>
-              <w:pStyle w:val="NoParagraphStyle"/>
-              <w:spacing w:line="240" w:lineRule="auto"/>
-              <w:textAlignment w:val="auto"/>
-              <w:rPr>
-                <w:rFonts w:ascii="Calibri" w:hAnsi="Calibri" w:cs="Times New Roman"/>
-                <w:color w:val="auto"/>
-                <w:lang w:val="en-AU"/>
-              </w:rPr>
-            </w:pPr>
-          </w:p>
-        </w:tc>
-        <w:tc>
-          <w:tcPr>
-            <w:tcW w:w="1418" w:type="dxa"/>
-          </w:tcPr>
-          <w:p>
-            <w:pPr>
-              <w:pStyle w:val="NoParagraphStyle"/>
-              <w:spacing w:line="240" w:lineRule="auto"/>
-              <w:textAlignment w:val="auto"/>
-              <w:rPr>
-                <w:rFonts w:ascii="Calibri" w:hAnsi="Calibri" w:cs="Times New Roman"/>
-                <w:color w:val="auto"/>
-                <w:lang w:val="en-AU"/>
-              </w:rPr>
-            </w:pPr>
-          </w:p>
-        </w:tc>
-        <w:tc>
-          <w:tcPr>
-            <w:tcW w:w="2693" w:type="dxa"/>
-          </w:tcPr>
-          <w:p>
-            <w:pPr>
-              <w:pStyle w:val="NoParagraphStyle"/>
-              <w:spacing w:line="240" w:lineRule="auto"/>
-              <w:textAlignment w:val="auto"/>
-              <w:rPr>
-                <w:rFonts w:ascii="Calibri" w:hAnsi="Calibri" w:cs="Times New Roman"/>
-                <w:color w:val="auto"/>
-                <w:lang w:val="en-AU"/>
-              </w:rPr>
-            </w:pPr>
-          </w:p>
-        </w:tc>
-        <w:tc>
-          <w:tcPr>
-            <w:tcW w:w="2268" w:type="dxa"/>
-          </w:tcPr>
-          <w:p>
-            <w:pPr>
-              <w:pStyle w:val="NoParagraphStyle"/>
-              <w:spacing w:line="240" w:lineRule="auto"/>
-              <w:textAlignment w:val="auto"/>
-              <w:rPr>
-                <w:rFonts w:ascii="Calibri" w:hAnsi="Calibri" w:cs="Times New Roman"/>
-                <w:color w:val="auto"/>
-                <w:lang w:val="en-AU"/>
-              </w:rPr>
-            </w:pPr>
-          </w:p>
-        </w:tc>
-      </w:tr>
-      <w:tr>
-        <w:trPr>
-          <w:trHeight w:val="418"/>
-          <w:jc w:val="center"/>
-        </w:trPr>
-        <w:tc>
-          <w:tcPr>
-            <w:tcW w:w="1809" w:type="dxa"/>
-          </w:tcPr>
-          <w:p>
-            <w:pPr>
-              <w:pStyle w:val="NoParagraphStyle"/>
-              <w:spacing w:line="240" w:lineRule="auto"/>
-              <w:textAlignment w:val="auto"/>
-              <w:rPr>
-                <w:rFonts w:ascii="Calibri" w:hAnsi="Calibri" w:cs="Times New Roman"/>
-                <w:color w:val="auto"/>
-                <w:lang w:val="en-AU"/>
-              </w:rPr>
-            </w:pPr>
-          </w:p>
-        </w:tc>
-        <w:tc>
-          <w:tcPr>
-            <w:tcW w:w="1843" w:type="dxa"/>
-          </w:tcPr>
-          <w:p>
-            <w:pPr>
-              <w:pStyle w:val="NoParagraphStyle"/>
-              <w:spacing w:line="240" w:lineRule="auto"/>
-              <w:textAlignment w:val="auto"/>
-              <w:rPr>
-                <w:rFonts w:ascii="Calibri" w:hAnsi="Calibri" w:cs="Times New Roman"/>
-                <w:color w:val="auto"/>
-                <w:lang w:val="en-AU"/>
-              </w:rPr>
-            </w:pPr>
-          </w:p>
-        </w:tc>
-        <w:tc>
-          <w:tcPr>
-            <w:tcW w:w="1418" w:type="dxa"/>
-          </w:tcPr>
-          <w:p>
-            <w:pPr>
-              <w:pStyle w:val="NoParagraphStyle"/>
-              <w:spacing w:line="240" w:lineRule="auto"/>
-              <w:textAlignment w:val="auto"/>
-              <w:rPr>
-                <w:rFonts w:ascii="Calibri" w:hAnsi="Calibri" w:cs="Times New Roman"/>
-                <w:color w:val="auto"/>
-                <w:lang w:val="en-AU"/>
-              </w:rPr>
-            </w:pPr>
-          </w:p>
-        </w:tc>
-        <w:tc>
-          <w:tcPr>
-            <w:tcW w:w="2693" w:type="dxa"/>
-          </w:tcPr>
-          <w:p>
-            <w:pPr>
-              <w:pStyle w:val="NoParagraphStyle"/>
-              <w:spacing w:line="240" w:lineRule="auto"/>
-              <w:textAlignment w:val="auto"/>
-              <w:rPr>
-                <w:rFonts w:ascii="Calibri" w:hAnsi="Calibri" w:cs="Times New Roman"/>
-                <w:color w:val="auto"/>
-                <w:lang w:val="en-AU"/>
-              </w:rPr>
-            </w:pPr>
-          </w:p>
-        </w:tc>
-        <w:tc>
-          <w:tcPr>
-            <w:tcW w:w="2268" w:type="dxa"/>
-          </w:tcPr>
-          <w:p>
-            <w:pPr>
-              <w:pStyle w:val="NoParagraphStyle"/>
-              <w:spacing w:line="240" w:lineRule="auto"/>
-              <w:textAlignment w:val="auto"/>
-              <w:rPr>
-                <w:rFonts w:ascii="Calibri" w:hAnsi="Calibri" w:cs="Times New Roman"/>
-                <w:color w:val="auto"/>
-                <w:lang w:val="en-AU"/>
-              </w:rPr>
-            </w:pPr>
-          </w:p>
-        </w:tc>
-      </w:tr>
-      <w:tr>
-        <w:trPr>
-          <w:trHeight w:val="418"/>
-          <w:jc w:val="center"/>
-        </w:trPr>
-        <w:tc>
-          <w:tcPr>
-            <w:tcW w:w="1809" w:type="dxa"/>
-          </w:tcPr>
-          <w:p>
-            <w:pPr>
-              <w:pStyle w:val="NoParagraphStyle"/>
-              <w:spacing w:line="240" w:lineRule="auto"/>
-              <w:textAlignment w:val="auto"/>
-              <w:rPr>
-                <w:rFonts w:ascii="Calibri" w:hAnsi="Calibri" w:cs="Times New Roman"/>
-                <w:color w:val="auto"/>
-                <w:lang w:val="en-AU"/>
-              </w:rPr>
-            </w:pPr>
-          </w:p>
-        </w:tc>
-        <w:tc>
-          <w:tcPr>
-            <w:tcW w:w="1843" w:type="dxa"/>
-          </w:tcPr>
-          <w:p>
-            <w:pPr>
-              <w:pStyle w:val="NoParagraphStyle"/>
-              <w:spacing w:line="240" w:lineRule="auto"/>
-              <w:textAlignment w:val="auto"/>
-              <w:rPr>
-                <w:rFonts w:ascii="Calibri" w:hAnsi="Calibri" w:cs="Times New Roman"/>
-                <w:color w:val="auto"/>
-                <w:lang w:val="en-AU"/>
-              </w:rPr>
-            </w:pPr>
-          </w:p>
-        </w:tc>
-        <w:tc>
-          <w:tcPr>
-            <w:tcW w:w="1418" w:type="dxa"/>
-          </w:tcPr>
-          <w:p>
-            <w:pPr>
-              <w:pStyle w:val="NoParagraphStyle"/>
-              <w:spacing w:line="240" w:lineRule="auto"/>
-              <w:textAlignment w:val="auto"/>
-              <w:rPr>
-                <w:rFonts w:ascii="Calibri" w:hAnsi="Calibri" w:cs="Times New Roman"/>
-                <w:color w:val="auto"/>
-                <w:lang w:val="en-AU"/>
-              </w:rPr>
-            </w:pPr>
-          </w:p>
-        </w:tc>
-        <w:tc>
-          <w:tcPr>
-            <w:tcW w:w="2693" w:type="dxa"/>
-          </w:tcPr>
-          <w:p>
-            <w:pPr>
-              <w:pStyle w:val="NoParagraphStyle"/>
-              <w:spacing w:line="240" w:lineRule="auto"/>
-              <w:textAlignment w:val="auto"/>
-              <w:rPr>
-                <w:rFonts w:ascii="Calibri" w:hAnsi="Calibri" w:cs="Times New Roman"/>
-                <w:color w:val="auto"/>
-                <w:lang w:val="en-AU"/>
-              </w:rPr>
-            </w:pPr>
-          </w:p>
-        </w:tc>
-        <w:tc>
-          <w:tcPr>
-            <w:tcW w:w="2268" w:type="dxa"/>
-          </w:tcPr>
-          <w:p>
-            <w:pPr>
-              <w:pStyle w:val="NoParagraphStyle"/>
-              <w:spacing w:line="240" w:lineRule="auto"/>
-              <w:textAlignment w:val="auto"/>
-              <w:rPr>
-                <w:rFonts w:ascii="Calibri" w:hAnsi="Calibri" w:cs="Times New Roman"/>
-                <w:color w:val="auto"/>
-                <w:lang w:val="en-AU"/>
-              </w:rPr>
-            </w:pPr>
-          </w:p>
-        </w:tc>
-      </w:tr>
-      <w:tr>
-        <w:trPr>
-          <w:trHeight w:val="418"/>
-          <w:jc w:val="center"/>
-        </w:trPr>
-        <w:tc>
-          <w:tcPr>
-            <w:tcW w:w="1809" w:type="dxa"/>
-          </w:tcPr>
-          <w:p>
-            <w:pPr>
-              <w:pStyle w:val="NoParagraphStyle"/>
-              <w:spacing w:line="240" w:lineRule="auto"/>
-              <w:textAlignment w:val="auto"/>
-              <w:rPr>
-                <w:rFonts w:ascii="Calibri" w:hAnsi="Calibri" w:cs="Times New Roman"/>
-                <w:color w:val="auto"/>
-                <w:lang w:val="en-AU"/>
-              </w:rPr>
-            </w:pPr>
-          </w:p>
-        </w:tc>
-        <w:tc>
-          <w:tcPr>
-            <w:tcW w:w="1843" w:type="dxa"/>
-          </w:tcPr>
-          <w:p>
-            <w:pPr>
-              <w:pStyle w:val="NoParagraphStyle"/>
-              <w:spacing w:line="240" w:lineRule="auto"/>
-              <w:textAlignment w:val="auto"/>
-              <w:rPr>
-                <w:rFonts w:ascii="Calibri" w:hAnsi="Calibri" w:cs="Times New Roman"/>
-                <w:color w:val="auto"/>
-                <w:lang w:val="en-AU"/>
-              </w:rPr>
-            </w:pPr>
-          </w:p>
-        </w:tc>
-        <w:tc>
-          <w:tcPr>
-            <w:tcW w:w="1418" w:type="dxa"/>
-          </w:tcPr>
-          <w:p>
-            <w:pPr>
-              <w:pStyle w:val="NoParagraphStyle"/>
-              <w:spacing w:line="240" w:lineRule="auto"/>
-              <w:textAlignment w:val="auto"/>
-              <w:rPr>
-                <w:rFonts w:ascii="Calibri" w:hAnsi="Calibri" w:cs="Times New Roman"/>
-                <w:color w:val="auto"/>
-                <w:lang w:val="en-AU"/>
-              </w:rPr>
-            </w:pPr>
-          </w:p>
-        </w:tc>
-        <w:tc>
-          <w:tcPr>
-            <w:tcW w:w="2693" w:type="dxa"/>
-          </w:tcPr>
-          <w:p>
-            <w:pPr>
-              <w:pStyle w:val="NoParagraphStyle"/>
-              <w:spacing w:line="240" w:lineRule="auto"/>
-              <w:textAlignment w:val="auto"/>
-              <w:rPr>
-                <w:rFonts w:ascii="Calibri" w:hAnsi="Calibri" w:cs="Times New Roman"/>
-                <w:color w:val="auto"/>
-                <w:lang w:val="en-AU"/>
-              </w:rPr>
-            </w:pPr>
-          </w:p>
-        </w:tc>
-        <w:tc>
-          <w:tcPr>
-            <w:tcW w:w="2268" w:type="dxa"/>
-          </w:tcPr>
-          <w:p>
-            <w:pPr>
-              <w:pStyle w:val="NoParagraphStyle"/>
-              <w:spacing w:line="240" w:lineRule="auto"/>
-              <w:textAlignment w:val="auto"/>
-              <w:rPr>
-                <w:rFonts w:ascii="Calibri" w:hAnsi="Calibri" w:cs="Times New Roman"/>
-                <w:color w:val="auto"/>
-                <w:lang w:val="en-AU"/>
-              </w:rPr>
-            </w:pPr>
+            <w:r>
+              <w:rPr>
+                <w:rFonts w:ascii="Calibri" w:hAnsi="Calibri" w:cs="Times New Roman"/>
+                <w:color w:val="auto"/>
+                <w:lang w:val="en-AU"/>
+              </w:rPr>
+              <w:t>29/02/2026</w:t>
+            </w:r>
           </w:p>
         </w:tc>
       </w:tr>

</xml_diff>

<commit_message>
Finished WHS Management Plan (kinda)
Finished the WHS Management Plan without feedback
</commit_message>
<xml_diff>
--- a/Callum Wyndham - WHS Management Plan.docx
+++ b/Callum Wyndham - WHS Management Plan.docx
@@ -79,7 +79,7 @@
           </mc:Choice>
           <mc:Fallback>
             <w:pict>
-              <v:line w14:anchorId="4DBAA2F5" id="Straight Connector 1" o:spid="_x0000_s1026" style="position:absolute;z-index:251664384;visibility:visible;mso-wrap-style:square;mso-width-percent:0;mso-height-percent:0;mso-wrap-distance-left:9pt;mso-wrap-distance-top:0;mso-wrap-distance-right:9pt;mso-wrap-distance-bottom:0;mso-position-horizontal:absolute;mso-position-horizontal-relative:margin;mso-position-vertical:absolute;mso-position-vertical-relative:text;mso-width-percent:0;mso-height-percent:0;mso-width-relative:margin;mso-height-relative:margin" from="0,52pt" to="457.1pt,52pt" o:gfxdata="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" strokecolor="#81bc00" strokeweight="3pt">
+              <v:line w14:anchorId="0F9F3897" id="Straight Connector 1" o:spid="_x0000_s1026" style="position:absolute;z-index:251664384;visibility:visible;mso-wrap-style:square;mso-width-percent:0;mso-height-percent:0;mso-wrap-distance-left:9pt;mso-wrap-distance-top:0;mso-wrap-distance-right:9pt;mso-wrap-distance-bottom:0;mso-position-horizontal:absolute;mso-position-horizontal-relative:margin;mso-position-vertical:absolute;mso-position-vertical-relative:text;mso-width-percent:0;mso-height-percent:0;mso-width-relative:margin;mso-height-relative:margin" from="0,52pt" to="457.1pt,52pt" o:gfxdata="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" strokecolor="#81bc00" strokeweight="3pt">
                 <w10:wrap type="topAndBottom" anchorx="margin"/>
               </v:line>
             </w:pict>
@@ -380,35 +380,7 @@
         <w:rPr>
           <w:color w:val="auto"/>
         </w:rPr>
-        <w:t xml:space="preserve">&gt; is committed to ensuring, so far as is reasonably practicable, the health and safety of its </w:t>
-      </w:r>
-      <w:proofErr w:type="gramStart"/>
-      <w:r>
-        <w:rPr>
-          <w:color w:val="auto"/>
-        </w:rPr>
-        <w:t>works</w:t>
-      </w:r>
-      <w:proofErr w:type="gramEnd"/>
-      <w:r>
-        <w:rPr>
-          <w:color w:val="auto"/>
-        </w:rPr>
-        <w:t xml:space="preserve"> while they are at work, and that the health and safety of other </w:t>
-      </w:r>
-      <w:proofErr w:type="gramStart"/>
-      <w:r>
-        <w:rPr>
-          <w:color w:val="auto"/>
-        </w:rPr>
-        <w:t>persons</w:t>
-      </w:r>
-      <w:proofErr w:type="gramEnd"/>
-      <w:r>
-        <w:rPr>
-          <w:color w:val="auto"/>
-        </w:rPr>
-        <w:t xml:space="preserve"> is not put at risk from our operations. This will be achieved by</w:t>
+        <w:t>&gt; is committed to ensuring, so far as is reasonably practicable, the health and safety of its works while they are at work, and that the health and safety of other persons is not put at risk from our operations. This will be achieved by</w:t>
       </w:r>
       <w:r>
         <w:rPr>
@@ -428,7 +400,13 @@
         <w:rPr>
           <w:color w:val="auto"/>
         </w:rPr>
-        <w:t xml:space="preserve">providing </w:t>
+        <w:t>P</w:t>
+      </w:r>
+      <w:r>
+        <w:rPr>
+          <w:color w:val="auto"/>
+        </w:rPr>
+        <w:t xml:space="preserve">roviding </w:t>
       </w:r>
       <w:r>
         <w:rPr>
@@ -448,7 +426,13 @@
         <w:rPr>
           <w:color w:val="auto"/>
         </w:rPr>
-        <w:t>making sure all equipment is properly maintained</w:t>
+        <w:t>M</w:t>
+      </w:r>
+      <w:r>
+        <w:rPr>
+          <w:color w:val="auto"/>
+        </w:rPr>
+        <w:t>aking sure all equipment is properly maintained</w:t>
       </w:r>
     </w:p>
     <w:p>
@@ -462,7 +446,13 @@
         <w:rPr>
           <w:color w:val="auto"/>
         </w:rPr>
-        <w:t>ensuring all personnel have received the correct amount of training</w:t>
+        <w:t>E</w:t>
+      </w:r>
+      <w:r>
+        <w:rPr>
+          <w:color w:val="auto"/>
+        </w:rPr>
+        <w:t>nsuring all personnel have received the correct amount of training</w:t>
       </w:r>
     </w:p>
     <w:p>
@@ -683,7 +673,14 @@
           <w:color w:val="auto"/>
           <w:lang w:val="en-AU"/>
         </w:rPr>
-        <w:t>modelling health and safety leadership</w:t>
+        <w:t>M</w:t>
+      </w:r>
+      <w:r>
+        <w:rPr>
+          <w:color w:val="auto"/>
+          <w:lang w:val="en-AU"/>
+        </w:rPr>
+        <w:t>odelling health and safety leadership</w:t>
       </w:r>
     </w:p>
     <w:p>
@@ -703,7 +700,14 @@
           <w:color w:val="auto"/>
           <w:lang w:val="en-AU"/>
         </w:rPr>
-        <w:t>demonstrating a commitment to good health and safety performance</w:t>
+        <w:t>D</w:t>
+      </w:r>
+      <w:r>
+        <w:rPr>
+          <w:color w:val="auto"/>
+          <w:lang w:val="en-AU"/>
+        </w:rPr>
+        <w:t>emonstrating a commitment to good health and safety performance</w:t>
       </w:r>
     </w:p>
     <w:p>
@@ -723,7 +727,14 @@
           <w:color w:val="auto"/>
           <w:lang w:val="en-AU"/>
         </w:rPr>
-        <w:t>ensuring workers and visitors know how to keep themselves safe</w:t>
+        <w:t>E</w:t>
+      </w:r>
+      <w:r>
+        <w:rPr>
+          <w:color w:val="auto"/>
+          <w:lang w:val="en-AU"/>
+        </w:rPr>
+        <w:t>nsuring workers and visitors know how to keep themselves safe</w:t>
       </w:r>
     </w:p>
     <w:p>
@@ -743,7 +754,14 @@
           <w:color w:val="auto"/>
           <w:lang w:val="en-AU"/>
         </w:rPr>
-        <w:t>maintaining a safe working environment</w:t>
+        <w:t>M</w:t>
+      </w:r>
+      <w:r>
+        <w:rPr>
+          <w:color w:val="auto"/>
+          <w:lang w:val="en-AU"/>
+        </w:rPr>
+        <w:t>aintaining a safe working environment</w:t>
       </w:r>
     </w:p>
     <w:p>
@@ -818,7 +836,13 @@
         <w:rPr>
           <w:color w:val="auto"/>
         </w:rPr>
-        <w:t>ensuring their own personal health and safety, and that of others in the workplace</w:t>
+        <w:t>E</w:t>
+      </w:r>
+      <w:r>
+        <w:rPr>
+          <w:color w:val="auto"/>
+        </w:rPr>
+        <w:t>nsuring their own personal health and safety, and that of others in the workplace</w:t>
       </w:r>
     </w:p>
     <w:p>
@@ -832,7 +856,13 @@
         <w:rPr>
           <w:color w:val="auto"/>
         </w:rPr>
-        <w:t>complying with any reasonable directions (such as safe work procedures, wearing personal protective equipment) given by management that relates to health and safety</w:t>
+        <w:t>C</w:t>
+      </w:r>
+      <w:r>
+        <w:rPr>
+          <w:color w:val="auto"/>
+        </w:rPr>
+        <w:t>omplying with any reasonable directions (such as safe work procedures, wearing personal protective equipment) given by management that relates to health and safety</w:t>
       </w:r>
     </w:p>
     <w:p>
@@ -846,7 +876,27 @@
         <w:rPr>
           <w:color w:val="auto"/>
         </w:rPr>
-        <w:t>Cooperate with policies and procedures relating to WHS in the workplace</w:t>
+        <w:t>Cooperating</w:t>
+      </w:r>
+      <w:r>
+        <w:rPr>
+          <w:color w:val="auto"/>
+        </w:rPr>
+        <w:t xml:space="preserve"> with policies and procedures relating to WHS in the workplace</w:t>
+      </w:r>
+    </w:p>
+    <w:p>
+      <w:pPr>
+        <w:pStyle w:val="ParagraphStyle1"/>
+        <w:rPr>
+          <w:color w:val="auto"/>
+        </w:rPr>
+      </w:pPr>
+      <w:r>
+        <w:rPr>
+          <w:color w:val="auto"/>
+        </w:rPr>
+        <w:t>Taking reasonable action when a hazard is identified</w:t>
       </w:r>
     </w:p>
     <w:p>
@@ -868,35 +918,7 @@
         <w:rPr>
           <w:color w:val="auto"/>
         </w:rPr>
-        <w:t xml:space="preserve">It is acknowledged that, in accordance with the Act, a worker may cease, or refuse to carry out work if they </w:t>
-      </w:r>
-      <w:proofErr w:type="gramStart"/>
-      <w:r>
-        <w:rPr>
-          <w:color w:val="auto"/>
-        </w:rPr>
-        <w:t>have</w:t>
-      </w:r>
-      <w:proofErr w:type="gramEnd"/>
-      <w:r>
-        <w:rPr>
-          <w:color w:val="auto"/>
-        </w:rPr>
-        <w:t xml:space="preserve"> a reasonable </w:t>
-      </w:r>
-      <w:proofErr w:type="gramStart"/>
-      <w:r>
-        <w:rPr>
-          <w:color w:val="auto"/>
-        </w:rPr>
-        <w:t>concern</w:t>
-      </w:r>
-      <w:proofErr w:type="gramEnd"/>
-      <w:r>
-        <w:rPr>
-          <w:color w:val="auto"/>
-        </w:rPr>
-        <w:t xml:space="preserve"> the work would expose the worker to a serious risk </w:t>
+        <w:t xml:space="preserve">It is acknowledged that, in accordance with the Act, a worker may cease, or refuse to carry out work if they have a reasonable concern the work would expose the worker to a serious risk </w:t>
       </w:r>
       <w:r>
         <w:rPr>
@@ -986,7 +1008,21 @@
         <w:rPr>
           <w:color w:val="auto"/>
         </w:rPr>
-        <w:t>Ensure their own personal health and safety</w:t>
+        <w:t>Ensure that the policies listed by the WHS legislation are in place</w:t>
+      </w:r>
+    </w:p>
+    <w:p>
+      <w:pPr>
+        <w:pStyle w:val="ParagraphStyle1"/>
+        <w:rPr>
+          <w:color w:val="auto"/>
+        </w:rPr>
+      </w:pPr>
+      <w:r>
+        <w:rPr>
+          <w:color w:val="auto"/>
+        </w:rPr>
+        <w:t>Make sure that others and themselves are working safely</w:t>
       </w:r>
     </w:p>
     <w:p>
@@ -1028,7 +1064,6 @@
           <w:bCs/>
           <w:color w:val="auto"/>
         </w:rPr>
-        <w:lastRenderedPageBreak/>
         <w:t xml:space="preserve">Health and Safety </w:t>
       </w:r>
       <w:r>
@@ -1172,7 +1207,10 @@
         </w:numPr>
       </w:pPr>
       <w:r>
-        <w:t>elimination (removal of the hazard)</w:t>
+        <w:t>E</w:t>
+      </w:r>
+      <w:r>
+        <w:t>limination (removal of the hazard)</w:t>
       </w:r>
     </w:p>
     <w:p>
@@ -1184,7 +1222,16 @@
         </w:numPr>
       </w:pPr>
       <w:r>
-        <w:t>substitution (substitute the hazard for something which is less hazardous e.g. replace a hazardous chemical with one within is not hazardous)</w:t>
+        <w:t>S</w:t>
+      </w:r>
+      <w:r>
+        <w:t xml:space="preserve">ubstitution (substitute the hazard for something which is less hazardous e.g. replace a </w:t>
+      </w:r>
+      <w:r>
+        <w:t>H</w:t>
+      </w:r>
+      <w:r>
+        <w:t>azardous chemical with one within is not hazardous)</w:t>
       </w:r>
     </w:p>
     <w:p>
@@ -1196,7 +1243,10 @@
         </w:numPr>
       </w:pPr>
       <w:r>
-        <w:t>isolation (isolate the hazard from people e.g. place a noisy piece of equipment in another location)</w:t>
+        <w:t>I</w:t>
+      </w:r>
+      <w:r>
+        <w:t>solation (isolate the hazard from people e.g. place a noisy piece of equipment in another location)</w:t>
       </w:r>
     </w:p>
     <w:p>
@@ -1208,7 +1258,10 @@
         </w:numPr>
       </w:pPr>
       <w:r>
-        <w:t>engineering (e.g. guarding on machinery)</w:t>
+        <w:t>E</w:t>
+      </w:r>
+      <w:r>
+        <w:t>ngineering (e.g. guarding on machinery)</w:t>
       </w:r>
     </w:p>
     <w:p>
@@ -1220,7 +1273,10 @@
         </w:numPr>
       </w:pPr>
       <w:r>
-        <w:t>administrative (e.g. provision of training, policies and procedures, signage)</w:t>
+        <w:t>A</w:t>
+      </w:r>
+      <w:r>
+        <w:t>dministrative (e.g. provision of training, policies and procedures, signage)</w:t>
       </w:r>
     </w:p>
     <w:p>
@@ -1232,13 +1288,14 @@
         </w:numPr>
       </w:pPr>
       <w:r>
-        <w:t xml:space="preserve">personal protective equipment (e.g. use of </w:t>
-      </w:r>
-      <w:proofErr w:type="gramStart"/>
-      <w:r>
-        <w:t>hearing ,</w:t>
-      </w:r>
-      <w:proofErr w:type="gramEnd"/>
+        <w:t>P</w:t>
+      </w:r>
+      <w:r>
+        <w:t xml:space="preserve">ersonal protective equipment (e.g. use of </w:t>
+      </w:r>
+      <w:r>
+        <w:t>hearing,</w:t>
+      </w:r>
       <w:r>
         <w:t xml:space="preserve"> eye protection, high visibility vests).</w:t>
       </w:r>
@@ -1280,7 +1337,7 @@
                     </pic:cNvPicPr>
                   </pic:nvPicPr>
                   <pic:blipFill>
-                    <a:blip r:embed="rId8">
+                    <a:blip r:embed="rId11">
                       <a:extLst>
                         <a:ext uri="{28A0092B-C50C-407E-A947-70E740481C1C}">
                           <a14:useLocalDpi xmlns:a14="http://schemas.microsoft.com/office/drawing/2010/main" val="0"/>
@@ -2463,21 +2520,7 @@
               <w:rPr>
                 <w:lang w:eastAsia="en-AU"/>
               </w:rPr>
-              <w:t>(</w:t>
-            </w:r>
-            <w:proofErr w:type="spellStart"/>
-            <w:r>
-              <w:rPr>
-                <w:lang w:eastAsia="en-AU"/>
-              </w:rPr>
-              <w:t>i</w:t>
-            </w:r>
-            <w:proofErr w:type="spellEnd"/>
-            <w:r>
-              <w:rPr>
-                <w:lang w:eastAsia="en-AU"/>
-              </w:rPr>
-              <w:t>) the risk level has been reduced to as low as reasonably practicable using the hierarchy of risk controls;</w:t>
+              <w:t>(i) the risk level has been reduced to as low as reasonably practicable using the hierarchy of risk controls;</w:t>
             </w:r>
           </w:p>
           <w:p>
@@ -2605,21 +2648,7 @@
               <w:rPr>
                 <w:lang w:eastAsia="en-AU"/>
               </w:rPr>
-              <w:t>(</w:t>
-            </w:r>
-            <w:proofErr w:type="spellStart"/>
-            <w:r>
-              <w:rPr>
-                <w:lang w:eastAsia="en-AU"/>
-              </w:rPr>
-              <w:t>i</w:t>
-            </w:r>
-            <w:proofErr w:type="spellEnd"/>
-            <w:r>
-              <w:rPr>
-                <w:lang w:eastAsia="en-AU"/>
-              </w:rPr>
-              <w:t>) the risk level has been reduced to as low as reasonably practicable using the hierarchy of risk controls;</w:t>
+              <w:t>(i) the risk level has been reduced to as low as reasonably practicable using the hierarchy of risk controls;</w:t>
             </w:r>
           </w:p>
           <w:p>
@@ -2908,7 +2937,7 @@
                 <w:color w:val="auto"/>
                 <w:lang w:val="en-AU"/>
               </w:rPr>
-              <w:t>Glass shards on floor from broken light</w:t>
+              <w:t>Staring at a screen for too long</w:t>
             </w:r>
           </w:p>
         </w:tc>
@@ -2933,7 +2962,7 @@
                 <w:color w:val="auto"/>
                 <w:lang w:val="en-AU"/>
               </w:rPr>
-              <w:t>Someone could potentially cut open their feet and go to hospital</w:t>
+              <w:t>Disruption of sleep cycle and discomfort in eyes</w:t>
             </w:r>
           </w:p>
         </w:tc>
@@ -2958,7 +2987,7 @@
                 <w:color w:val="auto"/>
                 <w:lang w:val="en-AU"/>
               </w:rPr>
-              <w:t>Rare</w:t>
+              <w:t>Likely</w:t>
             </w:r>
           </w:p>
         </w:tc>
@@ -2983,7 +3012,7 @@
                 <w:color w:val="auto"/>
                 <w:lang w:val="en-AU"/>
               </w:rPr>
-              <w:t>High</w:t>
+              <w:t>Low</w:t>
             </w:r>
           </w:p>
         </w:tc>
@@ -3014,7 +3043,7 @@
                 <w:color w:val="auto"/>
                 <w:lang w:val="en-AU"/>
               </w:rPr>
-              <w:t>Hot Coffee spilled on the ground</w:t>
+              <w:t>Sitting on a chair with bad posture</w:t>
             </w:r>
           </w:p>
         </w:tc>
@@ -3039,7 +3068,15 @@
                 <w:color w:val="auto"/>
                 <w:lang w:val="en-AU"/>
               </w:rPr>
-              <w:t>Someone could slip and be Injured</w:t>
+              <w:t>It can cause stress on our spinal structure, stiffness and muscle pain</w:t>
+            </w:r>
+            <w:r>
+              <w:rPr>
+                <w:rFonts w:ascii="Calibri" w:hAnsi="Calibri" w:cs="Times New Roman"/>
+                <w:color w:val="auto"/>
+                <w:lang w:val="en-AU"/>
+              </w:rPr>
+              <w:t xml:space="preserve"> </w:t>
             </w:r>
           </w:p>
         </w:tc>
@@ -3089,7 +3126,7 @@
                 <w:color w:val="auto"/>
                 <w:lang w:val="en-AU"/>
               </w:rPr>
-              <w:t>Low</w:t>
+              <w:t>High</w:t>
             </w:r>
           </w:p>
         </w:tc>
@@ -3120,7 +3157,7 @@
                 <w:color w:val="auto"/>
                 <w:lang w:val="en-AU"/>
               </w:rPr>
-              <w:t>Damaged power cords dangling from roof</w:t>
+              <w:t>Spilling coffee on the ground</w:t>
             </w:r>
           </w:p>
         </w:tc>
@@ -3145,7 +3182,7 @@
                 <w:color w:val="auto"/>
                 <w:lang w:val="en-AU"/>
               </w:rPr>
-              <w:t>Someone could walk into it and get electrocuted or trapped in them</w:t>
+              <w:t>It could cause a person to slip and fall, which can lead to serious injuries depending on the location of the spillage</w:t>
             </w:r>
           </w:p>
         </w:tc>
@@ -3170,7 +3207,7 @@
                 <w:color w:val="auto"/>
                 <w:lang w:val="en-AU"/>
               </w:rPr>
-              <w:t>Rare</w:t>
+              <w:t>Unlikely</w:t>
             </w:r>
           </w:p>
         </w:tc>
@@ -3195,7 +3232,7 @@
                 <w:color w:val="auto"/>
                 <w:lang w:val="en-AU"/>
               </w:rPr>
-              <w:t>High</w:t>
+              <w:t>Medium</w:t>
             </w:r>
           </w:p>
         </w:tc>
@@ -3226,7 +3263,7 @@
                 <w:color w:val="auto"/>
                 <w:lang w:val="en-AU"/>
               </w:rPr>
-              <w:t>Inhaling Asbestos</w:t>
+              <w:t>Not getting enough sleep</w:t>
             </w:r>
           </w:p>
         </w:tc>
@@ -3251,7 +3288,7 @@
                 <w:color w:val="auto"/>
                 <w:lang w:val="en-AU"/>
               </w:rPr>
-              <w:t>Potential for lung cancer and Mesothelioma</w:t>
+              <w:t>It causes a negative effect on brain function, including a reduced amount of concentration.</w:t>
             </w:r>
           </w:p>
         </w:tc>
@@ -3276,7 +3313,7 @@
                 <w:color w:val="auto"/>
                 <w:lang w:val="en-AU"/>
               </w:rPr>
-              <w:t>Possible</w:t>
+              <w:t>Likely</w:t>
             </w:r>
           </w:p>
         </w:tc>
@@ -3301,7 +3338,7 @@
                 <w:color w:val="auto"/>
                 <w:lang w:val="en-AU"/>
               </w:rPr>
-              <w:t>High</w:t>
+              <w:t>Medium</w:t>
             </w:r>
           </w:p>
         </w:tc>
@@ -3311,10 +3348,10 @@
     <w:p>
       <w:pPr>
         <w:sectPr>
-          <w:headerReference w:type="even" r:id="rId9"/>
-          <w:headerReference w:type="default" r:id="rId10"/>
-          <w:footerReference w:type="default" r:id="rId11"/>
-          <w:headerReference w:type="first" r:id="rId12"/>
+          <w:headerReference w:type="even" r:id="rId12"/>
+          <w:headerReference w:type="default" r:id="rId13"/>
+          <w:footerReference w:type="default" r:id="rId14"/>
+          <w:headerReference w:type="first" r:id="rId15"/>
           <w:pgSz w:w="11906" w:h="16838"/>
           <w:pgMar w:top="1440" w:right="1440" w:bottom="1440" w:left="1440" w:header="340" w:footer="708" w:gutter="0"/>
           <w:cols w:space="708"/>
@@ -3386,6 +3423,14 @@
               </w:rPr>
               <w:t>Programming Inc Headquarters</w:t>
             </w:r>
+            <w:r>
+              <w:rPr>
+                <w:rFonts w:ascii="Calibri" w:hAnsi="Calibri" w:cs="Times New Roman"/>
+                <w:color w:val="auto"/>
+                <w:lang w:val="en-AU"/>
+              </w:rPr>
+              <w:t>, Brisbane, Queensland</w:t>
+            </w:r>
           </w:p>
         </w:tc>
       </w:tr>
@@ -3476,7 +3521,15 @@
                 <w:color w:val="auto"/>
                 <w:lang w:val="en-AU"/>
               </w:rPr>
-              <w:t>19/02/2026</w:t>
+              <w:t>25</w:t>
+            </w:r>
+            <w:r>
+              <w:rPr>
+                <w:rFonts w:ascii="Calibri" w:hAnsi="Calibri" w:cs="Times New Roman"/>
+                <w:color w:val="auto"/>
+                <w:lang w:val="en-AU"/>
+              </w:rPr>
+              <w:t>/02/2026</w:t>
             </w:r>
           </w:p>
         </w:tc>
@@ -3974,7 +4027,7 @@
                 <w:color w:val="auto"/>
                 <w:lang w:val="en-AU"/>
               </w:rPr>
-              <w:t>High</w:t>
+              <w:t>Significant</w:t>
             </w:r>
           </w:p>
         </w:tc>
@@ -4161,7 +4214,7 @@
                 <w:color w:val="auto"/>
                 <w:lang w:val="en-AU"/>
               </w:rPr>
-              <w:t>Medium</w:t>
+              <w:t>Moderate</w:t>
             </w:r>
           </w:p>
         </w:tc>
@@ -4213,6 +4266,14 @@
                 <w:lang w:val="en-AU"/>
               </w:rPr>
               <w:t>The person who spills</w:t>
+            </w:r>
+            <w:r>
+              <w:rPr>
+                <w:rFonts w:ascii="Calibri" w:hAnsi="Calibri" w:cs="Times New Roman"/>
+                <w:color w:val="auto"/>
+                <w:lang w:val="en-AU"/>
+              </w:rPr>
+              <w:t xml:space="preserve"> it</w:t>
             </w:r>
           </w:p>
         </w:tc>
@@ -4297,7 +4358,7 @@
                 <w:color w:val="auto"/>
                 <w:lang w:val="en-AU"/>
               </w:rPr>
-              <w:t>Testing Software</w:t>
+              <w:t>Making a password</w:t>
             </w:r>
           </w:p>
         </w:tc>
@@ -4322,7 +4383,7 @@
                 <w:color w:val="auto"/>
                 <w:lang w:val="en-AU"/>
               </w:rPr>
-              <w:t>Getting distracted because it’s too entertaining</w:t>
+              <w:t>Someone could hack into a database and steal confidential files</w:t>
             </w:r>
           </w:p>
         </w:tc>
@@ -4348,7 +4409,7 @@
                 <w:color w:val="auto"/>
                 <w:lang w:val="en-AU"/>
               </w:rPr>
-              <w:t>Low</w:t>
+              <w:t>High</w:t>
             </w:r>
           </w:p>
         </w:tc>
@@ -4374,7 +4435,7 @@
                 <w:color w:val="auto"/>
                 <w:lang w:val="en-AU"/>
               </w:rPr>
-              <w:t>Close the software</w:t>
+              <w:t>Change the password to be one that is secure</w:t>
             </w:r>
           </w:p>
         </w:tc>
@@ -4399,7 +4460,7 @@
                 <w:color w:val="auto"/>
                 <w:lang w:val="en-AU"/>
               </w:rPr>
-              <w:t>The distracted Person</w:t>
+              <w:t>The creator of the password</w:t>
             </w:r>
           </w:p>
         </w:tc>
@@ -4424,7 +4485,7 @@
                 <w:color w:val="auto"/>
                 <w:lang w:val="en-AU"/>
               </w:rPr>
-              <w:t>When distracted</w:t>
+              <w:t>Now</w:t>
             </w:r>
           </w:p>
         </w:tc>
@@ -4566,15 +4627,7 @@
                 <w:color w:val="auto"/>
                 <w:lang w:val="en-AU"/>
               </w:rPr>
-              <w:t xml:space="preserve"> </w:t>
-            </w:r>
-            <w:r>
-              <w:rPr>
-                <w:rFonts w:cs="Times New Roman"/>
-                <w:color w:val="auto"/>
-                <w:lang w:val="en-AU"/>
-              </w:rPr>
-              <w:t>Programming Inc Headquarters</w:t>
+              <w:t xml:space="preserve"> Programming Inc Headquarters</w:t>
             </w:r>
           </w:p>
         </w:tc>
@@ -4597,7 +4650,13 @@
               <w:t>Date:</w:t>
             </w:r>
             <w:r>
-              <w:t xml:space="preserve"> 19/02/2026</w:t>
+              <w:t xml:space="preserve"> </w:t>
+            </w:r>
+            <w:r>
+              <w:t>25</w:t>
+            </w:r>
+            <w:r>
+              <w:t>/02/2026</w:t>
             </w:r>
           </w:p>
         </w:tc>
@@ -4622,7 +4681,31 @@
                 <w:color w:val="auto"/>
                 <w:lang w:val="en-AU"/>
               </w:rPr>
-              <w:t>29/02/2026</w:t>
+              <w:t>18</w:t>
+            </w:r>
+            <w:r>
+              <w:rPr>
+                <w:rFonts w:cs="Times New Roman"/>
+                <w:color w:val="auto"/>
+                <w:lang w:val="en-AU"/>
+              </w:rPr>
+              <w:t>/0</w:t>
+            </w:r>
+            <w:r>
+              <w:rPr>
+                <w:rFonts w:cs="Times New Roman"/>
+                <w:color w:val="auto"/>
+                <w:lang w:val="en-AU"/>
+              </w:rPr>
+              <w:t>3</w:t>
+            </w:r>
+            <w:r>
+              <w:rPr>
+                <w:rFonts w:cs="Times New Roman"/>
+                <w:color w:val="auto"/>
+                <w:lang w:val="en-AU"/>
+              </w:rPr>
+              <w:t>/2026</w:t>
             </w:r>
           </w:p>
         </w:tc>
@@ -4753,7 +4836,7 @@
                 <w:color w:val="auto"/>
                 <w:lang w:val="en-AU"/>
               </w:rPr>
-              <w:t>Elimination</w:t>
+              <w:t>Proper chair posture</w:t>
             </w:r>
           </w:p>
         </w:tc>
@@ -4778,7 +4861,7 @@
                 <w:color w:val="auto"/>
                 <w:lang w:val="en-AU"/>
               </w:rPr>
-              <w:t>WHS Training</w:t>
+              <w:t>How to sit on a chair in a way that doesn’t risk their health</w:t>
             </w:r>
           </w:p>
         </w:tc>
@@ -4803,7 +4886,7 @@
                 <w:color w:val="auto"/>
                 <w:lang w:val="en-AU"/>
               </w:rPr>
-              <w:t>John Doe</w:t>
+              <w:t>Everyone</w:t>
             </w:r>
           </w:p>
         </w:tc>
@@ -4828,7 +4911,39 @@
                 <w:color w:val="auto"/>
                 <w:lang w:val="en-AU"/>
               </w:rPr>
-              <w:t>We will teach him how to properly dispose of dangerous substances and things that pose risk</w:t>
+              <w:t>A s</w:t>
+            </w:r>
+            <w:r>
+              <w:rPr>
+                <w:rFonts w:ascii="Calibri" w:hAnsi="Calibri" w:cs="Times New Roman"/>
+                <w:color w:val="auto"/>
+                <w:lang w:val="en-AU"/>
+              </w:rPr>
+              <w:t xml:space="preserve">imple </w:t>
+            </w:r>
+            <w:r>
+              <w:rPr>
+                <w:rFonts w:ascii="Calibri" w:hAnsi="Calibri" w:cs="Times New Roman"/>
+                <w:color w:val="auto"/>
+                <w:lang w:val="en-AU"/>
+              </w:rPr>
+              <w:t>p</w:t>
+            </w:r>
+            <w:r>
+              <w:rPr>
+                <w:rFonts w:ascii="Calibri" w:hAnsi="Calibri" w:cs="Times New Roman"/>
+                <w:color w:val="auto"/>
+                <w:lang w:val="en-AU"/>
+              </w:rPr>
+              <w:t>resentation</w:t>
+            </w:r>
+            <w:r>
+              <w:rPr>
+                <w:rFonts w:ascii="Calibri" w:hAnsi="Calibri" w:cs="Times New Roman"/>
+                <w:color w:val="auto"/>
+                <w:lang w:val="en-AU"/>
+              </w:rPr>
+              <w:t xml:space="preserve"> covering what bad posture is and how to correct it</w:t>
             </w:r>
           </w:p>
         </w:tc>
@@ -4853,7 +4968,31 @@
                 <w:color w:val="auto"/>
                 <w:lang w:val="en-AU"/>
               </w:rPr>
-              <w:t>29/02/2026</w:t>
+              <w:t>0</w:t>
+            </w:r>
+            <w:r>
+              <w:rPr>
+                <w:rFonts w:ascii="Calibri" w:hAnsi="Calibri" w:cs="Times New Roman"/>
+                <w:color w:val="auto"/>
+                <w:lang w:val="en-AU"/>
+              </w:rPr>
+              <w:t>9/0</w:t>
+            </w:r>
+            <w:r>
+              <w:rPr>
+                <w:rFonts w:ascii="Calibri" w:hAnsi="Calibri" w:cs="Times New Roman"/>
+                <w:color w:val="auto"/>
+                <w:lang w:val="en-AU"/>
+              </w:rPr>
+              <w:t>3</w:t>
+            </w:r>
+            <w:r>
+              <w:rPr>
+                <w:rFonts w:ascii="Calibri" w:hAnsi="Calibri" w:cs="Times New Roman"/>
+                <w:color w:val="auto"/>
+                <w:lang w:val="en-AU"/>
+              </w:rPr>
+              <w:t>/2026</w:t>
             </w:r>
           </w:p>
         </w:tc>
@@ -4884,7 +5023,7 @@
                 <w:color w:val="auto"/>
                 <w:lang w:val="en-AU"/>
               </w:rPr>
-              <w:t>Substitution</w:t>
+              <w:t>Secure Passwords</w:t>
             </w:r>
           </w:p>
         </w:tc>
@@ -4909,7 +5048,7 @@
                 <w:color w:val="auto"/>
                 <w:lang w:val="en-AU"/>
               </w:rPr>
-              <w:t>WHS Training</w:t>
+              <w:t>How to create a safe and secure password to ensure no one can hack into any accounts</w:t>
             </w:r>
           </w:p>
         </w:tc>
@@ -4934,7 +5073,7 @@
                 <w:color w:val="auto"/>
                 <w:lang w:val="en-AU"/>
               </w:rPr>
-              <w:t>Jane Doe</w:t>
+              <w:t>Everyone</w:t>
             </w:r>
           </w:p>
         </w:tc>
@@ -4959,7 +5098,7 @@
                 <w:color w:val="auto"/>
                 <w:lang w:val="en-AU"/>
               </w:rPr>
-              <w:t>We will teach her what dangerous substances have safe alternatives to turn to.</w:t>
+              <w:t>A presentation showing examples of good and bad passwords and how to make a secure password using things like password managers and generators</w:t>
             </w:r>
           </w:p>
         </w:tc>
@@ -4984,7 +5123,31 @@
                 <w:color w:val="auto"/>
                 <w:lang w:val="en-AU"/>
               </w:rPr>
-              <w:t>29/02/2026</w:t>
+              <w:t>12</w:t>
+            </w:r>
+            <w:r>
+              <w:rPr>
+                <w:rFonts w:ascii="Calibri" w:hAnsi="Calibri" w:cs="Times New Roman"/>
+                <w:color w:val="auto"/>
+                <w:lang w:val="en-AU"/>
+              </w:rPr>
+              <w:t>/0</w:t>
+            </w:r>
+            <w:r>
+              <w:rPr>
+                <w:rFonts w:ascii="Calibri" w:hAnsi="Calibri" w:cs="Times New Roman"/>
+                <w:color w:val="auto"/>
+                <w:lang w:val="en-AU"/>
+              </w:rPr>
+              <w:t>3</w:t>
+            </w:r>
+            <w:r>
+              <w:rPr>
+                <w:rFonts w:ascii="Calibri" w:hAnsi="Calibri" w:cs="Times New Roman"/>
+                <w:color w:val="auto"/>
+                <w:lang w:val="en-AU"/>
+              </w:rPr>
+              <w:t>/2026</w:t>
             </w:r>
           </w:p>
         </w:tc>
@@ -5015,7 +5178,7 @@
                 <w:color w:val="auto"/>
                 <w:lang w:val="en-AU"/>
               </w:rPr>
-              <w:t>Personal Protective Equipment</w:t>
+              <w:t>Proper breaks and rests</w:t>
             </w:r>
           </w:p>
         </w:tc>
@@ -5040,7 +5203,7 @@
                 <w:color w:val="auto"/>
                 <w:lang w:val="en-AU"/>
               </w:rPr>
-              <w:t>WHS Training</w:t>
+              <w:t>What to do to get a proper amount of time away from a screen</w:t>
             </w:r>
           </w:p>
         </w:tc>
@@ -5065,7 +5228,7 @@
                 <w:color w:val="auto"/>
                 <w:lang w:val="en-AU"/>
               </w:rPr>
-              <w:t>Joe Bloggs</w:t>
+              <w:t>Everyone</w:t>
             </w:r>
           </w:p>
         </w:tc>
@@ -5090,7 +5253,7 @@
                 <w:color w:val="auto"/>
                 <w:lang w:val="en-AU"/>
               </w:rPr>
-              <w:t>We will teach him about what protective gear he should wear and when he needs to wear it in the workplace</w:t>
+              <w:t>A presentation that shows the benefits of breaks, as well as a guide around places you could take a walk to and places to rest, relax and reset</w:t>
             </w:r>
           </w:p>
         </w:tc>
@@ -5115,7 +5278,31 @@
                 <w:color w:val="auto"/>
                 <w:lang w:val="en-AU"/>
               </w:rPr>
-              <w:t>29/02/2026</w:t>
+              <w:t>18</w:t>
+            </w:r>
+            <w:r>
+              <w:rPr>
+                <w:rFonts w:ascii="Calibri" w:hAnsi="Calibri" w:cs="Times New Roman"/>
+                <w:color w:val="auto"/>
+                <w:lang w:val="en-AU"/>
+              </w:rPr>
+              <w:t>/0</w:t>
+            </w:r>
+            <w:r>
+              <w:rPr>
+                <w:rFonts w:ascii="Calibri" w:hAnsi="Calibri" w:cs="Times New Roman"/>
+                <w:color w:val="auto"/>
+                <w:lang w:val="en-AU"/>
+              </w:rPr>
+              <w:t>3</w:t>
+            </w:r>
+            <w:r>
+              <w:rPr>
+                <w:rFonts w:ascii="Calibri" w:hAnsi="Calibri" w:cs="Times New Roman"/>
+                <w:color w:val="auto"/>
+                <w:lang w:val="en-AU"/>
+              </w:rPr>
+              <w:t>/2026</w:t>
             </w:r>
           </w:p>
         </w:tc>
@@ -7701,13 +7888,207 @@
 </file>
 
 <file path=customXml/item1.xml><?xml version="1.0" encoding="utf-8"?>
+<ct:contentTypeSchema xmlns:ct="http://schemas.microsoft.com/office/2006/metadata/contentType" xmlns:ma="http://schemas.microsoft.com/office/2006/metadata/properties/metaAttributes" ct:_="" ma:_="" ma:contentTypeName="Document" ma:contentTypeID="0x010100E8DD461D9AF0CE478E08EE9AE4B29A86" ma:contentTypeVersion="4" ma:contentTypeDescription="Create a new document." ma:contentTypeScope="" ma:versionID="ede1086ed553fc75398ed1be035031c7">
+  <xsd:schema xmlns:xsd="http://www.w3.org/2001/XMLSchema" xmlns:xs="http://www.w3.org/2001/XMLSchema" xmlns:p="http://schemas.microsoft.com/office/2006/metadata/properties" xmlns:ns3="b4c2a8e4-81c5-4e19-8593-ed885ca314a1" targetNamespace="http://schemas.microsoft.com/office/2006/metadata/properties" ma:root="true" ma:fieldsID="5542562b3adc35532af12942abc9440a" ns3:_="">
+    <xsd:import namespace="b4c2a8e4-81c5-4e19-8593-ed885ca314a1"/>
+    <xsd:element name="properties">
+      <xsd:complexType>
+        <xsd:sequence>
+          <xsd:element name="documentManagement">
+            <xsd:complexType>
+              <xsd:all>
+                <xsd:element ref="ns3:MediaServiceDateTaken" minOccurs="0"/>
+                <xsd:element ref="ns3:MediaServiceMetadata" minOccurs="0"/>
+                <xsd:element ref="ns3:MediaServiceFastMetadata" minOccurs="0"/>
+                <xsd:element ref="ns3:MediaServiceSearchProperties" minOccurs="0"/>
+              </xsd:all>
+            </xsd:complexType>
+          </xsd:element>
+        </xsd:sequence>
+      </xsd:complexType>
+    </xsd:element>
+  </xsd:schema>
+  <xsd:schema xmlns:xsd="http://www.w3.org/2001/XMLSchema" xmlns:xs="http://www.w3.org/2001/XMLSchema" xmlns:dms="http://schemas.microsoft.com/office/2006/documentManagement/types" xmlns:pc="http://schemas.microsoft.com/office/infopath/2007/PartnerControls" targetNamespace="b4c2a8e4-81c5-4e19-8593-ed885ca314a1" elementFormDefault="qualified">
+    <xsd:import namespace="http://schemas.microsoft.com/office/2006/documentManagement/types"/>
+    <xsd:import namespace="http://schemas.microsoft.com/office/infopath/2007/PartnerControls"/>
+    <xsd:element name="MediaServiceDateTaken" ma:index="8" nillable="true" ma:displayName="MediaServiceDateTaken" ma:hidden="true" ma:indexed="true" ma:internalName="MediaServiceDateTaken" ma:readOnly="true">
+      <xsd:simpleType>
+        <xsd:restriction base="dms:Text"/>
+      </xsd:simpleType>
+    </xsd:element>
+    <xsd:element name="MediaServiceMetadata" ma:index="9" nillable="true" ma:displayName="MediaServiceMetadata" ma:hidden="true" ma:internalName="MediaServiceMetadata" ma:readOnly="true">
+      <xsd:simpleType>
+        <xsd:restriction base="dms:Note"/>
+      </xsd:simpleType>
+    </xsd:element>
+    <xsd:element name="MediaServiceFastMetadata" ma:index="10" nillable="true" ma:displayName="MediaServiceFastMetadata" ma:hidden="true" ma:internalName="MediaServiceFastMetadata" ma:readOnly="true">
+      <xsd:simpleType>
+        <xsd:restriction base="dms:Note"/>
+      </xsd:simpleType>
+    </xsd:element>
+    <xsd:element name="MediaServiceSearchProperties" ma:index="11" nillable="true" ma:displayName="MediaServiceSearchProperties" ma:hidden="true" ma:internalName="MediaServiceSearchProperties" ma:readOnly="true">
+      <xsd:simpleType>
+        <xsd:restriction base="dms:Note"/>
+      </xsd:simpleType>
+    </xsd:element>
+  </xsd:schema>
+  <xsd:schema xmlns="http://schemas.openxmlformats.org/package/2006/metadata/core-properties" xmlns:xsd="http://www.w3.org/2001/XMLSchema" xmlns:xsi="http://www.w3.org/2001/XMLSchema-instance" xmlns:dc="http://purl.org/dc/elements/1.1/" xmlns:dcterms="http://purl.org/dc/terms/" xmlns:odoc="http://schemas.microsoft.com/internal/obd" targetNamespace="http://schemas.openxmlformats.org/package/2006/metadata/core-properties" elementFormDefault="qualified" attributeFormDefault="unqualified" blockDefault="#all">
+    <xsd:import namespace="http://purl.org/dc/elements/1.1/" schemaLocation="http://dublincore.org/schemas/xmls/qdc/2003/04/02/dc.xsd"/>
+    <xsd:import namespace="http://purl.org/dc/terms/" schemaLocation="http://dublincore.org/schemas/xmls/qdc/2003/04/02/dcterms.xsd"/>
+    <xsd:element name="coreProperties" type="CT_coreProperties"/>
+    <xsd:complexType name="CT_coreProperties">
+      <xsd:all>
+        <xsd:element ref="dc:creator" minOccurs="0" maxOccurs="1"/>
+        <xsd:element ref="dcterms:created" minOccurs="0" maxOccurs="1"/>
+        <xsd:element ref="dc:identifier" minOccurs="0" maxOccurs="1"/>
+        <xsd:element name="contentType" minOccurs="0" maxOccurs="1" type="xsd:string" ma:index="0" ma:displayName="Content Type"/>
+        <xsd:element ref="dc:title" minOccurs="0" maxOccurs="1" ma:index="4" ma:displayName="Title"/>
+        <xsd:element ref="dc:subject" minOccurs="0" maxOccurs="1"/>
+        <xsd:element ref="dc:description" minOccurs="0" maxOccurs="1"/>
+        <xsd:element name="keywords" minOccurs="0" maxOccurs="1" type="xsd:string"/>
+        <xsd:element ref="dc:language" minOccurs="0" maxOccurs="1"/>
+        <xsd:element name="category" minOccurs="0" maxOccurs="1" type="xsd:string"/>
+        <xsd:element name="version" minOccurs="0" maxOccurs="1" type="xsd:string"/>
+        <xsd:element name="revision" minOccurs="0" maxOccurs="1" type="xsd:string">
+          <xsd:annotation>
+            <xsd:documentation>
+                        This value indicates the number of saves or revisions. The application is responsible for updating this value after each revision.
+                    </xsd:documentation>
+          </xsd:annotation>
+        </xsd:element>
+        <xsd:element name="lastModifiedBy" minOccurs="0" maxOccurs="1" type="xsd:string"/>
+        <xsd:element ref="dcterms:modified" minOccurs="0" maxOccurs="1"/>
+        <xsd:element name="contentStatus" minOccurs="0" maxOccurs="1" type="xsd:string"/>
+      </xsd:all>
+    </xsd:complexType>
+  </xsd:schema>
+  <xs:schema xmlns:pc="http://schemas.microsoft.com/office/infopath/2007/PartnerControls" xmlns:xs="http://www.w3.org/2001/XMLSchema" targetNamespace="http://schemas.microsoft.com/office/infopath/2007/PartnerControls" elementFormDefault="qualified" attributeFormDefault="unqualified">
+    <xs:element name="Person">
+      <xs:complexType>
+        <xs:sequence>
+          <xs:element ref="pc:DisplayName" minOccurs="0"/>
+          <xs:element ref="pc:AccountId" minOccurs="0"/>
+          <xs:element ref="pc:AccountType" minOccurs="0"/>
+        </xs:sequence>
+      </xs:complexType>
+    </xs:element>
+    <xs:element name="DisplayName" type="xs:string"/>
+    <xs:element name="AccountId" type="xs:string"/>
+    <xs:element name="AccountType" type="xs:string"/>
+    <xs:element name="BDCAssociatedEntity">
+      <xs:complexType>
+        <xs:sequence>
+          <xs:element ref="pc:BDCEntity" minOccurs="0" maxOccurs="unbounded"/>
+        </xs:sequence>
+        <xs:attribute ref="pc:EntityNamespace"/>
+        <xs:attribute ref="pc:EntityName"/>
+        <xs:attribute ref="pc:SystemInstanceName"/>
+        <xs:attribute ref="pc:AssociationName"/>
+      </xs:complexType>
+    </xs:element>
+    <xs:attribute name="EntityNamespace" type="xs:string"/>
+    <xs:attribute name="EntityName" type="xs:string"/>
+    <xs:attribute name="SystemInstanceName" type="xs:string"/>
+    <xs:attribute name="AssociationName" type="xs:string"/>
+    <xs:element name="BDCEntity">
+      <xs:complexType>
+        <xs:sequence>
+          <xs:element ref="pc:EntityDisplayName" minOccurs="0"/>
+          <xs:element ref="pc:EntityInstanceReference" minOccurs="0"/>
+          <xs:element ref="pc:EntityId1" minOccurs="0"/>
+          <xs:element ref="pc:EntityId2" minOccurs="0"/>
+          <xs:element ref="pc:EntityId3" minOccurs="0"/>
+          <xs:element ref="pc:EntityId4" minOccurs="0"/>
+          <xs:element ref="pc:EntityId5" minOccurs="0"/>
+        </xs:sequence>
+      </xs:complexType>
+    </xs:element>
+    <xs:element name="EntityDisplayName" type="xs:string"/>
+    <xs:element name="EntityInstanceReference" type="xs:string"/>
+    <xs:element name="EntityId1" type="xs:string"/>
+    <xs:element name="EntityId2" type="xs:string"/>
+    <xs:element name="EntityId3" type="xs:string"/>
+    <xs:element name="EntityId4" type="xs:string"/>
+    <xs:element name="EntityId5" type="xs:string"/>
+    <xs:element name="Terms">
+      <xs:complexType>
+        <xs:sequence>
+          <xs:element ref="pc:TermInfo" minOccurs="0" maxOccurs="unbounded"/>
+        </xs:sequence>
+      </xs:complexType>
+    </xs:element>
+    <xs:element name="TermInfo">
+      <xs:complexType>
+        <xs:sequence>
+          <xs:element ref="pc:TermName" minOccurs="0"/>
+          <xs:element ref="pc:TermId" minOccurs="0"/>
+        </xs:sequence>
+      </xs:complexType>
+    </xs:element>
+    <xs:element name="TermName" type="xs:string"/>
+    <xs:element name="TermId" type="xs:string"/>
+  </xs:schema>
+</ct:contentTypeSchema>
+</file>
+
+<file path=customXml/item2.xml><?xml version="1.0" encoding="utf-8"?>
 <b:Sources xmlns:b="http://schemas.openxmlformats.org/officeDocument/2006/bibliography" xmlns="http://schemas.openxmlformats.org/officeDocument/2006/bibliography" SelectedStyle="\APA.XSL" StyleName="APA"/>
 </file>
 
+<file path=customXml/item3.xml><?xml version="1.0" encoding="utf-8"?>
+<p:properties xmlns:p="http://schemas.microsoft.com/office/2006/metadata/properties" xmlns:xsi="http://www.w3.org/2001/XMLSchema-instance" xmlns:pc="http://schemas.microsoft.com/office/infopath/2007/PartnerControls">
+  <documentManagement/>
+</p:properties>
+</file>
+
+<file path=customXml/item4.xml><?xml version="1.0" encoding="utf-8"?>
+<?mso-contentType ?>
+<FormTemplates xmlns="http://schemas.microsoft.com/sharepoint/v3/contenttype/forms">
+  <Display>DocumentLibraryForm</Display>
+  <Edit>DocumentLibraryForm</Edit>
+  <New>DocumentLibraryForm</New>
+</FormTemplates>
+</file>
+
 <file path=customXml/itemProps1.xml><?xml version="1.0" encoding="utf-8"?>
+<ds:datastoreItem xmlns:ds="http://schemas.openxmlformats.org/officeDocument/2006/customXml" ds:itemID="{44549E7A-B6B0-43CB-85A8-EF8BBC80665C}">
+  <ds:schemaRefs>
+    <ds:schemaRef ds:uri="http://schemas.microsoft.com/office/2006/metadata/contentType"/>
+    <ds:schemaRef ds:uri="http://schemas.microsoft.com/office/2006/metadata/properties/metaAttributes"/>
+    <ds:schemaRef ds:uri="http://www.w3.org/2001/XMLSchema"/>
+    <ds:schemaRef ds:uri="http://schemas.microsoft.com/office/2006/metadata/properties"/>
+    <ds:schemaRef ds:uri="b4c2a8e4-81c5-4e19-8593-ed885ca314a1"/>
+    <ds:schemaRef ds:uri="http://schemas.microsoft.com/office/2006/documentManagement/types"/>
+    <ds:schemaRef ds:uri="http://schemas.microsoft.com/office/infopath/2007/PartnerControls"/>
+    <ds:schemaRef ds:uri="http://schemas.openxmlformats.org/package/2006/metadata/core-properties"/>
+    <ds:schemaRef ds:uri="http://purl.org/dc/elements/1.1/"/>
+    <ds:schemaRef ds:uri="http://purl.org/dc/terms/"/>
+    <ds:schemaRef ds:uri="http://schemas.microsoft.com/internal/obd"/>
+  </ds:schemaRefs>
+</ds:datastoreItem>
+</file>
+
+<file path=customXml/itemProps2.xml><?xml version="1.0" encoding="utf-8"?>
 <ds:datastoreItem xmlns:ds="http://schemas.openxmlformats.org/officeDocument/2006/customXml" ds:itemID="{23C3A1C1-472A-4693-A5F7-64A50BF41BAA}">
   <ds:schemaRefs>
     <ds:schemaRef ds:uri="http://schemas.openxmlformats.org/officeDocument/2006/bibliography"/>
   </ds:schemaRefs>
 </ds:datastoreItem>
+</file>
+
+<file path=customXml/itemProps3.xml><?xml version="1.0" encoding="utf-8"?>
+<ds:datastoreItem xmlns:ds="http://schemas.openxmlformats.org/officeDocument/2006/customXml" ds:itemID="{1C9E4802-3C61-429B-B8E7-206421F9C4CC}">
+  <ds:schemaRefs>
+    <ds:schemaRef ds:uri="http://schemas.microsoft.com/office/2006/metadata/properties"/>
+    <ds:schemaRef ds:uri="http://schemas.microsoft.com/office/infopath/2007/PartnerControls"/>
+  </ds:schemaRefs>
+</ds:datastoreItem>
+</file>
+
+<file path=customXml/itemProps4.xml><?xml version="1.0" encoding="utf-8"?>
+<ds:datastoreItem xmlns:ds="http://schemas.openxmlformats.org/officeDocument/2006/customXml" ds:itemID="{C4C29D18-BFED-4ECB-8CF8-593A064F2504}">
+  <ds:schemaRefs>
+    <ds:schemaRef ds:uri="http://schemas.microsoft.com/sharepoint/v3/contenttype/forms"/>
+  </ds:schemaRefs>
+</ds:datastoreItem>
 </file>
</xml_diff>